<commit_message>
Use LR1 five-year average TCE in the payback sensitivity
Replace the rough 2025-level TCE assumption (35,000 $/day) with the LR1
five-year realised average of about 33,000 $/day (TORM 2021-25, Hafnia),
which is the benchmark that fits a 75k DWT hull; the Aframax average would
overstate it. Payback rows become 0.81 / 3.4 / 8.3 years. Note on the slide
that TD9 fell from WS373 to WS197 (39,600 $/day) one week after the report's
reference date, and cite the contract-price ranges by yard country.

Q&A document: update the payback answers with the verified 2026 TD9 timeline
(April Hormuz peak, late-July and late-August prints), add a question on the
inconsistent inputs between the rotor-sail and economics sections of the
report (methanol price, operating days, route distance), and add the
formula lineage for the build-cost estimate.

Co-Authored-By: Claude Fable 5.1 <noreply@anthropic.com>
Claude-Session: https://claude.ai/code/session_01KYxRjEufxoxoFhSS4GKPUN
</commit_message>
<xml_diff>
--- a/contest/presentation/2026_74K_발표대본_질의응답.docx
+++ b/contest/presentation/2026_74K_발표대본_질의응답.docx
@@ -297,7 +297,7 @@
           <w:sz w:val="21"/>
           <w:szCs w:val="21"/>
         </w:rPr>
-        <w:t xml:space="preserve">총 발화량 약 2352 음절 · 보통 속도(분당 280 음절) 기준 순수 발화 8:24 + 슬라이드 전환·호흡 0:43 = </w:t>
+        <w:t xml:space="preserve">총 발화량 약 2351 음절 · 보통 속도(분당 280 음절) 기준 순수 발화 8:24 + 슬라이드 전환·호흡 0:43 = </w:t>
       </w:r>
       <w:r>
         <w:rPr>
@@ -6261,7 +6261,7 @@
                 <w:sz w:val="23"/>
                 <w:szCs w:val="23"/>
               </w:rPr>
-              <w:t xml:space="preserve">경제성입니다. 건조비는 약 2,666만 달러입니다. 회수기간은 2026년 8월 시황 기준 0.81년이지만, 2025년 평균 운임과 시장 신조선가를 적용하면 약 8년으로 시황에 크게 좌우됩니다. 정리하면 본 설계선은 국제 규정과 선급 요건을 모두 만족하면서, 메탄올 이중연료와 축발전기, 로터 세일로 EEDI Phase 3까지 만족시킨 74K급 원유운반선입니다.</w:t>
+              <w:t xml:space="preserve">경제성입니다. 건조비는 약 2,666만 달러입니다. 회수기간은 2026년 8월 시황 기준 0.81년이지만, LR1 5년 평균 운임과 시장 신조선가를 적용하면 약 8년으로 시황에 크게 좌우됩니다. 정리하면 본 설계선은 국제 규정과 선급 요건을 모두 만족하면서, 메탄올 이중연료와 축발전기, 로터 세일로 EEDI Phase 3까지 만족시킨 74K급 원유운반선입니다.</w:t>
             </w:r>
           </w:p>
         </w:tc>
@@ -20404,7 +20404,7 @@
                 <w:sz w:val="17"/>
                 <w:szCs w:val="17"/>
               </w:rPr>
-              <w:t xml:space="preserve">★☆☆</w:t>
+              <w:t xml:space="preserve">★★☆</w:t>
             </w:r>
           </w:p>
         </w:tc>
@@ -20438,7 +20438,7 @@
                 <w:sz w:val="17"/>
                 <w:szCs w:val="17"/>
               </w:rPr>
-              <w:t xml:space="preserve">메탄올 520달러/톤 가정은 타당합니까? 그린 메탄올이면요?</w:t>
+              <w:t xml:space="preserve">보고서 8장 안에서 메탄올 단가(520 vs 668.6 $/t), 연간 운항일(355 vs 250일), 편도 거리(1,652 vs 1,410 nm)가 절마다 다릅니다.</w:t>
             </w:r>
           </w:p>
         </w:tc>
@@ -20547,6 +20547,182 @@
                 <w:szCs w:val="17"/>
               </w:rPr>
               <w:t xml:space="preserve">I-6</w:t>
+            </w:r>
+          </w:p>
+        </w:tc>
+        <w:tc>
+          <w:tcPr>
+            <w:tcW w:type="dxa" w:w="900"/>
+            <w:tcBorders>
+              <w:top w:val="single" w:color="9CA3AF" w:sz="4"/>
+              <w:left w:val="single" w:color="9CA3AF" w:sz="4"/>
+              <w:bottom w:val="single" w:color="9CA3AF" w:sz="4"/>
+              <w:right w:val="single" w:color="9CA3AF" w:sz="4"/>
+            </w:tcBorders>
+            <w:tcMar>
+              <w:top w:type="dxa" w:w="60"/>
+              <w:left w:type="dxa" w:w="100"/>
+              <w:bottom w:type="dxa" w:w="60"/>
+              <w:right w:type="dxa" w:w="100"/>
+            </w:tcMar>
+          </w:tcPr>
+          <w:p>
+            <w:pPr>
+              <w:spacing w:after="0" w:line="270"/>
+              <w:jc w:val="left"/>
+            </w:pPr>
+            <w:r>
+              <w:rPr>
+                <w:rFonts w:ascii="Malgun Gothic" w:cs="Malgun Gothic" w:eastAsia="Malgun Gothic" w:hAnsi="Malgun Gothic"/>
+                <w:b w:val="false"/>
+                <w:bCs w:val="false"/>
+                <w:color w:val="222222"/>
+                <w:sz w:val="17"/>
+                <w:szCs w:val="17"/>
+              </w:rPr>
+              <w:t xml:space="preserve">★☆☆</w:t>
+            </w:r>
+          </w:p>
+        </w:tc>
+        <w:tc>
+          <w:tcPr>
+            <w:tcW w:type="dxa" w:w="6238"/>
+            <w:tcBorders>
+              <w:top w:val="single" w:color="9CA3AF" w:sz="4"/>
+              <w:left w:val="single" w:color="9CA3AF" w:sz="4"/>
+              <w:bottom w:val="single" w:color="9CA3AF" w:sz="4"/>
+              <w:right w:val="single" w:color="9CA3AF" w:sz="4"/>
+            </w:tcBorders>
+            <w:tcMar>
+              <w:top w:type="dxa" w:w="60"/>
+              <w:left w:type="dxa" w:w="100"/>
+              <w:bottom w:type="dxa" w:w="60"/>
+              <w:right w:type="dxa" w:w="100"/>
+            </w:tcMar>
+          </w:tcPr>
+          <w:p>
+            <w:pPr>
+              <w:spacing w:after="0" w:line="270"/>
+              <w:jc w:val="left"/>
+            </w:pPr>
+            <w:r>
+              <w:rPr>
+                <w:rFonts w:ascii="Malgun Gothic" w:cs="Malgun Gothic" w:eastAsia="Malgun Gothic" w:hAnsi="Malgun Gothic"/>
+                <w:b w:val="false"/>
+                <w:bCs w:val="false"/>
+                <w:color w:val="222222"/>
+                <w:sz w:val="17"/>
+                <w:szCs w:val="17"/>
+              </w:rPr>
+              <w:t xml:space="preserve">메탄올 520달러/톤 가정은 타당합니까? 그린 메탄올이면요?</w:t>
+            </w:r>
+          </w:p>
+        </w:tc>
+        <w:tc>
+          <w:tcPr>
+            <w:tcW w:type="dxa" w:w="1000"/>
+            <w:tcBorders>
+              <w:top w:val="single" w:color="9CA3AF" w:sz="4"/>
+              <w:left w:val="single" w:color="9CA3AF" w:sz="4"/>
+              <w:bottom w:val="single" w:color="9CA3AF" w:sz="4"/>
+              <w:right w:val="single" w:color="9CA3AF" w:sz="4"/>
+            </w:tcBorders>
+            <w:tcMar>
+              <w:top w:type="dxa" w:w="60"/>
+              <w:left w:type="dxa" w:w="100"/>
+              <w:bottom w:type="dxa" w:w="60"/>
+              <w:right w:type="dxa" w:w="100"/>
+            </w:tcMar>
+          </w:tcPr>
+          <w:p>
+            <w:pPr>
+              <w:spacing w:after="0" w:line="270"/>
+              <w:jc w:val="left"/>
+            </w:pPr>
+            <w:r>
+              <w:rPr>
+                <w:rFonts w:ascii="Malgun Gothic" w:cs="Malgun Gothic" w:eastAsia="Malgun Gothic" w:hAnsi="Malgun Gothic"/>
+                <w:b w:val="false"/>
+                <w:bCs w:val="false"/>
+                <w:color w:val="222222"/>
+                <w:sz w:val="17"/>
+                <w:szCs w:val="17"/>
+              </w:rPr>
+              <w:t xml:space="preserve">I-6</w:t>
+            </w:r>
+          </w:p>
+        </w:tc>
+        <w:tc>
+          <w:tcPr>
+            <w:tcW w:type="dxa" w:w="800"/>
+            <w:tcBorders>
+              <w:top w:val="single" w:color="9CA3AF" w:sz="4"/>
+              <w:left w:val="single" w:color="9CA3AF" w:sz="4"/>
+              <w:bottom w:val="single" w:color="9CA3AF" w:sz="4"/>
+              <w:right w:val="single" w:color="9CA3AF" w:sz="4"/>
+            </w:tcBorders>
+            <w:tcMar>
+              <w:top w:type="dxa" w:w="60"/>
+              <w:left w:type="dxa" w:w="100"/>
+              <w:bottom w:type="dxa" w:w="60"/>
+              <w:right w:type="dxa" w:w="100"/>
+            </w:tcMar>
+          </w:tcPr>
+          <w:p>
+            <w:pPr>
+              <w:spacing w:after="0" w:line="270"/>
+              <w:jc w:val="left"/>
+            </w:pPr>
+            <w:r>
+              <w:rPr>
+                <w:rFonts w:ascii="Malgun Gothic" w:cs="Malgun Gothic" w:eastAsia="Malgun Gothic" w:hAnsi="Malgun Gothic"/>
+                <w:b w:val="false"/>
+                <w:bCs w:val="false"/>
+                <w:color w:val="222222"/>
+                <w:sz w:val="17"/>
+                <w:szCs w:val="17"/>
+              </w:rPr>
+              <w:t xml:space="preserve"/>
+            </w:r>
+          </w:p>
+        </w:tc>
+      </w:tr>
+      <w:tr>
+        <w:trPr>
+          <w:cantSplit/>
+          <w:tblHeader w:val="false"/>
+        </w:trPr>
+        <w:tc>
+          <w:tcPr>
+            <w:tcW w:type="dxa" w:w="700"/>
+            <w:tcBorders>
+              <w:top w:val="single" w:color="9CA3AF" w:sz="4"/>
+              <w:left w:val="single" w:color="9CA3AF" w:sz="4"/>
+              <w:bottom w:val="single" w:color="9CA3AF" w:sz="4"/>
+              <w:right w:val="single" w:color="9CA3AF" w:sz="4"/>
+            </w:tcBorders>
+            <w:tcMar>
+              <w:top w:type="dxa" w:w="60"/>
+              <w:left w:type="dxa" w:w="100"/>
+              <w:bottom w:type="dxa" w:w="60"/>
+              <w:right w:type="dxa" w:w="100"/>
+            </w:tcMar>
+          </w:tcPr>
+          <w:p>
+            <w:pPr>
+              <w:spacing w:after="0" w:line="270"/>
+              <w:jc w:val="left"/>
+            </w:pPr>
+            <w:r>
+              <w:rPr>
+                <w:rFonts w:ascii="Malgun Gothic" w:cs="Malgun Gothic" w:eastAsia="Malgun Gothic" w:hAnsi="Malgun Gothic"/>
+                <w:b/>
+                <w:bCs/>
+                <w:color w:val="222222"/>
+                <w:sz w:val="17"/>
+                <w:szCs w:val="17"/>
+              </w:rPr>
+              <w:t xml:space="preserve">I-7</w:t>
             </w:r>
           </w:p>
         </w:tc>
@@ -22642,7 +22818,7 @@
                 <w:sz w:val="21"/>
                 <w:szCs w:val="21"/>
               </w:rPr>
-              <w:t xml:space="preserve">맞습니다. 0.81년은 두 가지 이유로 낙관적인 값입니다. 첫째, 운임입니다. 2026년 8월 21일 TD9가 WS373, 왕복 TCE 약 10.4만 달러였는데 이는 스파이크 구간이고, 2025년에는 같은 항로가 2월 약 1.5만 달러에서 12월 약 5만 달러 사이를 오갔습니다. 2025년 평균 수준인 3.5만 달러를 적용하면 회수기간은 3.1년이 됩니다. 둘째, 건조비입니다. 2,666만 달러는 경하중량과 주기관 마력 기반의 공수·재료비 산식으로 추정한 값으로, 조선소 마진, 금융비용, 메탄올 연료 시스템의 추가 원가가 빠져 있습니다. 2024~2026년 LR1 실제 계약가 5,500만~7,000만 달러에 메탄올 이중연료 프리미엄 약 10퍼센트를 더한 6,600만 달러를 적용하면 회수기간은 7.7년으로, 탱커 신조 투자의 통상 범위에 들어옵니다. 슬라이드에 이 세 경우를 함께 표시했고, 저희가 말씀드리고 싶은 경제성은 절대 회수기간보다 로터세일이 연간 약 92만 달러의 연료비를 절감해 자체 회수기간이 1.4~3.7년이라는 점입니다.</w:t>
+              <w:t xml:space="preserve">맞습니다. 0.81년은 두 가지 이유로 낙관적인 값입니다. 첫째, 운임입니다. 2026년 8월 21일 TD9가 WS373, 왕복 TCE 약 10.4만 달러였는데 이는 호르무즈 사태 이후 이어진 스파이크 구간이고, 실제로 일주일 뒤인 8월 28일에는 WS197, 3.96만 달러로 떨어졌습니다. LR1 선사들의 5년 실현 평균은 3.1~3.3만 달러 수준이라, 3.3만 달러를 적용하면 회수기간은 3.4년이 됩니다. 둘째, 건조비입니다. 2,666만 달러는 경하중량과 주기관 마력 기반의 공수·재료비 산식으로 추정한 값으로, 조선소 마진, 금융비용, 메탄올 연료 시스템의 추가 원가가 빠져 있습니다. 2024~2026년 LR1 실제 계약가는 중국 야드 5,300만~5,600만, 한국 야드 5,800만~6,200만 달러이고 메탄올 이중연료 프리미엄이 약 10퍼센트라, 6,600만 달러를 적용하면 회수기간은 8.3년으로 탱커 신조 투자의 통상 범위에 들어옵니다. 슬라이드에 이 세 경우를 함께 표시했고, 저희가 말씀드리고 싶은 경제성은 절대 회수기간보다 로터세일이 연간 약 92만 달러의 연료비를 절감해 자체 회수기간이 1.4~3.7년이라는 점입니다.</w:t>
             </w:r>
           </w:p>
         </w:tc>
@@ -22706,7 +22882,7 @@
                 <w:sz w:val="21"/>
                 <w:szCs w:val="21"/>
               </w:rPr>
-              <w:t xml:space="preserve">첫마디를 '맞습니다'로. 숫자 세 개(0.81 → 3.1 → 7.7년)를 순서대로 말하고 '로터세일 상대 경제성'으로 착지한다. 0.81년을 옹호하지 말 것.</w:t>
+              <w:t xml:space="preserve">첫마디를 '맞습니다'로. 숫자 세 개(0.81 → 3.4 → 8.3년)를 순서대로 말하고 '로터세일 상대 경제성'으로 착지한다. 0.81년을 옹호하지 말 것. '일주일 뒤 39,600달러'는 스스로 먼저 말하면 강점이 된다.</w:t>
             </w:r>
           </w:p>
         </w:tc>
@@ -30403,7 +30579,7 @@
                 <w:sz w:val="21"/>
                 <w:szCs w:val="21"/>
               </w:rPr>
-              <w:t xml:space="preserve">TCE, 즉 Time Charter Equivalent는 운임 수입에서 연료비·항비 같은 항해비를 이미 뺀 일당 수익입니다. 그래서 TCE 10.4만 달러에 연간 운항일 355일을 곱한 3,692만 달러에서, 항해비를 다시 빼지 않고 선원비·보험·수리비·선용품·관리비로 구성된 운용비 380만 달러만 빼서 순수익 3,311만 달러를 얻었습니다. 이를 건조비 2,666만 달러로 나눈 값이 0.805년입니다. 산정 논리 자체는 맞지만, 입력값 두 가지가 낙관적입니다. 운임은 2026년 8월 스파이크 값이고 건조비는 시장가의 절반 이하입니다. 2025년 평균 운임 3.5만 달러와 시장 신조선가 6,600만 달러를 넣으면 7.7년이 됩니다.</w:t>
+              <w:t xml:space="preserve">TCE, 즉 Time Charter Equivalent는 운임 수입에서 연료비·항비 같은 항해비를 이미 뺀 일당 수익입니다. 그래서 TCE 10.4만 달러에 연간 운항일 355일을 곱한 3,692만 달러에서, 항해비를 다시 빼지 않고 선원비·보험·수리비·선용품·관리비로 구성된 운용비 380만 달러만 빼서 순수익 3,311만 달러를 얻었습니다. 이를 건조비 2,666만 달러로 나눈 값이 0.805년입니다. 산정 논리 자체는 맞지만, 입력값 두 가지가 낙관적입니다. 운임은 2026년 8월 스파이크 값이고 건조비는 시장가의 절반 이하입니다. LR1 5년 평균 운임 3.3만 달러와 시장 신조선가 6,600만 달러를 넣으면 8.3년이 됩니다.</w:t>
             </w:r>
           </w:p>
         </w:tc>
@@ -30530,7 +30706,7 @@
           <w:sz w:val="21"/>
           <w:szCs w:val="21"/>
         </w:rPr>
-        <w:t xml:space="preserve">운임 가정의 출처 확인.</w:t>
+        <w:t xml:space="preserve">운임 가정의 출처와 시황 맥락 확인.</w:t>
       </w:r>
     </w:p>
     <w:tbl>
@@ -30591,131 +30767,7 @@
                 <w:sz w:val="21"/>
                 <w:szCs w:val="21"/>
               </w:rPr>
-              <w:t xml:space="preserve">Baltic Exchange 2026년 34주차 주간 리포트 기준으로 TD9가 전주 대비 5포인트 내린 WS373, 왕복 TCE 약 10만 4천 달러였습니다. 보고서 1.3.3절에도 같은 값을 인용했습니다. 다만 이 항로는 변동이 매우 커서 2025년 2월에는 WS113, TCE 약 1.5만 달러, 9~10월에는 WS165 전후로 3.8만 달러, 12월에 WS194로 약 5만 달러였습니다. 그래서 발표에서는 스파이크 값 하나가 아니라 2025년 평균 수준을 함께 놓고 민감도로 보여드렸습니다.</w:t>
-            </w:r>
-          </w:p>
-        </w:tc>
-      </w:tr>
-    </w:tbl>
-    <w:p>
-      <w:pPr>
-        <w:spacing w:after="100"/>
-      </w:pPr>
-      <w:r>
-        <w:rPr>
-          <w:rFonts w:ascii="Malgun Gothic" w:cs="Malgun Gothic" w:eastAsia="Malgun Gothic" w:hAnsi="Malgun Gothic"/>
-          <w:color w:val="222222"/>
-          <w:sz w:val="21"/>
-          <w:szCs w:val="21"/>
-        </w:rPr>
-        <w:t xml:space="preserve"/>
-      </w:r>
-    </w:p>
-    <w:p>
-      <w:pPr>
-        <w:pStyle w:val="Heading3"/>
-        <w:keepNext/>
-        <w:spacing w:after="80" w:before="200"/>
-      </w:pPr>
-      <w:r>
-        <w:rPr>
-          <w:rFonts w:ascii="Malgun Gothic" w:cs="Malgun Gothic" w:eastAsia="Malgun Gothic" w:hAnsi="Malgun Gothic"/>
-          <w:b/>
-          <w:bCs/>
-          <w:color w:val="1F3864"/>
-          <w:sz w:val="23"/>
-          <w:szCs w:val="23"/>
-        </w:rPr>
-        <w:t xml:space="preserve">[I-4] ★★☆   건조비 산식의 출처와 입력값은 무엇입니까? 왜 이렇게 낮게 나옵니까?</w:t>
-      </w:r>
-    </w:p>
-    <w:p>
-      <w:pPr>
-        <w:keepNext/>
-        <w:spacing w:after="80" w:line="300"/>
-      </w:pPr>
-      <w:r>
-        <w:rPr>
-          <w:rFonts w:ascii="Malgun Gothic" w:cs="Malgun Gothic" w:eastAsia="Malgun Gothic" w:hAnsi="Malgun Gothic"/>
-          <w:b/>
-          <w:bCs/>
-          <w:color w:val="595959"/>
-          <w:sz w:val="21"/>
-          <w:szCs w:val="21"/>
-        </w:rPr>
-        <w:t xml:space="preserve">의도  </w:t>
-      </w:r>
-      <w:r>
-        <w:rPr>
-          <w:rFonts w:ascii="Malgun Gothic" w:cs="Malgun Gothic" w:eastAsia="Malgun Gothic" w:hAnsi="Malgun Gothic"/>
-          <w:i/>
-          <w:iCs/>
-          <w:color w:val="595959"/>
-          <w:sz w:val="21"/>
-          <w:szCs w:val="21"/>
-        </w:rPr>
-        <w:t xml:space="preserve">건조비 2,666만 달러의 구조를 아는지 확인.</w:t>
-      </w:r>
-    </w:p>
-    <w:tbl>
-      <w:tblPr>
-        <w:tblW w:type="dxa" w:w="9638"/>
-        <w:tblBorders>
-          <w:top w:val="single" w:color="auto" w:sz="4"/>
-          <w:left w:val="single" w:color="auto" w:sz="4"/>
-          <w:bottom w:val="single" w:color="auto" w:sz="4"/>
-          <w:right w:val="single" w:color="auto" w:sz="4"/>
-          <w:insideH w:val="single" w:color="auto" w:sz="4"/>
-          <w:insideV w:val="single" w:color="auto" w:sz="4"/>
-        </w:tblBorders>
-      </w:tblPr>
-      <w:tblGrid>
-        <w:gridCol w:w="9638"/>
-      </w:tblGrid>
-      <w:tr>
-        <w:trPr>
-          <w:cantSplit/>
-        </w:trPr>
-        <w:tc>
-          <w:tcPr>
-            <w:tcW w:type="dxa" w:w="9638"/>
-            <w:tcBorders>
-              <w:top w:val="single" w:color="BFC5D2" w:sz="4"/>
-              <w:left w:val="single" w:color="BFC5D2" w:sz="4"/>
-              <w:bottom w:val="single" w:color="BFC5D2" w:sz="4"/>
-              <w:right w:val="single" w:color="BFC5D2" w:sz="4"/>
-            </w:tcBorders>
-            <w:shd w:fill="F2F5FA" w:color="auto" w:val="clear"/>
-            <w:tcMar>
-              <w:top w:type="dxa" w:w="120"/>
-              <w:left w:type="dxa" w:w="180"/>
-              <w:bottom w:type="dxa" w:w="120"/>
-              <w:right w:type="dxa" w:w="180"/>
-            </w:tcMar>
-          </w:tcPr>
-          <w:p>
-            <w:pPr>
-              <w:spacing w:after="0" w:line="310"/>
-            </w:pPr>
-            <w:r>
-              <w:rPr>
-                <w:rFonts w:ascii="Malgun Gothic" w:cs="Malgun Gothic" w:eastAsia="Malgun Gothic" w:hAnsi="Malgun Gothic"/>
-                <w:b/>
-                <w:bCs/>
-                <w:color w:val="1F3864"/>
-                <w:sz w:val="21"/>
-                <w:szCs w:val="21"/>
-              </w:rPr>
-              <w:t xml:space="preserve">답변  </w:t>
-            </w:r>
-            <w:r>
-              <w:rPr>
-                <w:rFonts w:ascii="Malgun Gothic" w:cs="Malgun Gothic" w:eastAsia="Malgun Gothic" w:hAnsi="Malgun Gothic"/>
-                <w:color w:val="222222"/>
-                <w:sz w:val="21"/>
-                <w:szCs w:val="21"/>
-              </w:rPr>
-              <w:t xml:space="preserve">경하중량 기반 공수 추정식에 임금단가를 곱한 공수비용 1,395만 달러, 선각강재 톤당 656달러·의장·기관부 재료비 1,028만 달러, 일반경비 10퍼센트 242만 달러의 합입니다. 공수 78.5만 시간 자체는 LR1급으로 현실적인 수준이지만, 시간당 임금 15.76달러, 기관부 재료비 370만 달러 등 단가가 낮고 조선소 이윤·설계비·금융비·선주 공급품·메탄올 연료계통 추가비가 빠져 있어 시장가의 절반 이하가 됩니다. 학생 설계의 상대 비교용 산식으로 이해해 주시면 되고, 절대 선가는 시장 계약가 5,500만~7,000만 달러를 기준으로 봐야 한다는 점을 발표에 함께 밝혔습니다.</w:t>
+              <w:t xml:space="preserve">Baltic Exchange 2026년 34주차 주간 리포트 기준으로 TD9가 전주 대비 5포인트 내린 WS373, 왕복 TCE 약 10만 4천 달러였고, 보고서 1.3.3절에도 같은 값을 인용했습니다. 다만 2026년은 이례적인 해였습니다. 4월 호르무즈 사태 때 TD9가 WS880, TCE 28만 달러까지 갔고, 7월 24일 WS459·13.6만, 8월 21일 WS373·10.4만을 거쳐 일주일 뒤인 8월 28일에는 WS197·3.96만 달러로 급락했으며 9월 4일에는 4.86만 달러였습니다. 2025년에는 같은 항로가 2월 WS113·1.5만에서 12월 WS194·5만 사이를 오갔습니다. 그래서 발표에서는 스파이크 값 하나가 아니라 LR1 5년 평균과 함께 민감도로 보여드렸습니다.</w:t>
             </w:r>
           </w:p>
         </w:tc>
@@ -30779,7 +30831,7 @@
                 <w:sz w:val="21"/>
                 <w:szCs w:val="21"/>
               </w:rPr>
-              <w:t xml:space="preserve">보고서 293쪽 본문의 중간값(공수비용 61,675,263 / 재료비용 47,217,783)은 최종표(13,952,986 / 10,280,126)와 다르다. 지적받으면 '최종표가 맞고 본문 중간 서술이 오기'로 즉시 인정.</w:t>
+              <w:t xml:space="preserve">8/28 WS197·39,600이 가장 강한 한 방이다. 심사위원이 묻기 전에 슬라이드 불릿에 이미 적어 두었다.</w:t>
             </w:r>
           </w:p>
         </w:tc>
@@ -30814,7 +30866,7 @@
           <w:sz w:val="23"/>
           <w:szCs w:val="23"/>
         </w:rPr>
-        <w:t xml:space="preserve">[I-5] ★☆☆   메탄올 520달러/톤 가정은 타당합니까? 그린 메탄올이면요?</w:t>
+        <w:t xml:space="preserve">[I-4] ★★☆   건조비 산식의 출처와 입력값은 무엇입니까? 왜 이렇게 낮게 나옵니까?</w:t>
       </w:r>
     </w:p>
     <w:p>
@@ -30842,7 +30894,7 @@
           <w:sz w:val="21"/>
           <w:szCs w:val="21"/>
         </w:rPr>
-        <w:t xml:space="preserve">연료가 가정.</w:t>
+        <w:t xml:space="preserve">건조비 2,666만 달러의 구조를 아는지 확인.</w:t>
       </w:r>
     </w:p>
     <w:tbl>
@@ -30903,7 +30955,71 @@
                 <w:sz w:val="21"/>
                 <w:szCs w:val="21"/>
               </w:rPr>
-              <w:t xml:space="preserve">marinemethanol.com의 2026년 시세 기준 회색 메탄올 가격입니다. 바이오·e-메탄올은 톤당 1,000~1,500달러 수준으로 연료비가 2~3배가 되므로 규제 인센티브 없이는 경제성이 크게 달라집니다. 본 설계는 회색 메탄올로 시작해 공급망 전환에 따라 그린 연료로 옮기는 시나리오를 전제합니다.</w:t>
+              <w:t xml:space="preserve">경하중량 기반 공수 추정식에 임금단가를 곱한 공수비용 1,395만 달러, 선각강재 톤당 656달러·의장·기관부 재료비 1,028만 달러, 일반경비 10퍼센트 242만 달러의 합입니다. 공수 78.5만 시간 자체는 LR1급으로 현실적인 수준이지만, 시간당 임금 15.76달러, 기관부 재료비 370만 달러 등 단가가 낮고 조선소 이윤·설계비·금융비·선주 공급품·메탄올 연료계통 추가비가 빠져 있어 시장가의 절반 이하가 됩니다. 학생 설계의 상대 비교용 산식으로 이해해 주시면 되고, 절대 선가는 시장 계약가 5,500만~7,000만 달러를 기준으로 봐야 한다는 점을 발표에 함께 밝혔습니다.</w:t>
+            </w:r>
+          </w:p>
+        </w:tc>
+      </w:tr>
+    </w:tbl>
+    <w:tbl>
+      <w:tblPr>
+        <w:tblW w:type="dxa" w:w="9638"/>
+        <w:tblBorders>
+          <w:top w:val="single" w:color="auto" w:sz="4"/>
+          <w:left w:val="single" w:color="auto" w:sz="4"/>
+          <w:bottom w:val="single" w:color="auto" w:sz="4"/>
+          <w:right w:val="single" w:color="auto" w:sz="4"/>
+          <w:insideH w:val="single" w:color="auto" w:sz="4"/>
+          <w:insideV w:val="single" w:color="auto" w:sz="4"/>
+        </w:tblBorders>
+      </w:tblPr>
+      <w:tblGrid>
+        <w:gridCol w:w="9638"/>
+      </w:tblGrid>
+      <w:tr>
+        <w:trPr>
+          <w:cantSplit/>
+        </w:trPr>
+        <w:tc>
+          <w:tcPr>
+            <w:tcW w:type="dxa" w:w="9638"/>
+            <w:tcBorders>
+              <w:top w:val="single" w:color="F0C36D" w:sz="4"/>
+              <w:left w:val="single" w:color="F0C36D" w:sz="4"/>
+              <w:bottom w:val="single" w:color="F0C36D" w:sz="4"/>
+              <w:right w:val="single" w:color="F0C36D" w:sz="4"/>
+            </w:tcBorders>
+            <w:shd w:fill="FFF4E5" w:color="auto" w:val="clear"/>
+            <w:tcMar>
+              <w:top w:type="dxa" w:w="120"/>
+              <w:left w:type="dxa" w:w="180"/>
+              <w:bottom w:type="dxa" w:w="120"/>
+              <w:right w:type="dxa" w:w="180"/>
+            </w:tcMar>
+          </w:tcPr>
+          <w:p>
+            <w:pPr>
+              <w:spacing w:after="0"/>
+            </w:pPr>
+            <w:r>
+              <w:rPr>
+                <w:rFonts w:ascii="Malgun Gothic" w:cs="Malgun Gothic" w:eastAsia="Malgun Gothic" w:hAnsi="Malgun Gothic"/>
+                <w:b/>
+                <w:bCs/>
+                <w:color w:val="C00000"/>
+                <w:sz w:val="21"/>
+                <w:szCs w:val="21"/>
+              </w:rPr>
+              <w:t xml:space="preserve">⚠ 주의  </w:t>
+            </w:r>
+            <w:r>
+              <w:rPr>
+                <w:rFonts w:ascii="Malgun Gothic" w:cs="Malgun Gothic" w:eastAsia="Malgun Gothic" w:hAnsi="Malgun Gothic"/>
+                <w:color w:val="222222"/>
+                <w:sz w:val="21"/>
+                <w:szCs w:val="21"/>
+              </w:rPr>
+              <w:t xml:space="preserve">보고서 293쪽 본문의 중간값(공수비용 61,675,263 / 재료비용 47,217,783)은 최종표(13,952,986 / 10,280,126)와 다르다. 지적받으면 '최종표가 맞고 본문 중간 서술이 오기'로 즉시 인정. 산식 계보를 물으면 Carreyette(1977, RINA)·Watson 'Practical Ship Design'(1998) 18장의 재료비·공수·간접비 3분법이라고 답한다. 기관부 재료비에 선정 엔진(SMCR 10,890)이 아니라 추정 MCR 9,648.9 kW를 넣은 점도 과소 요인.</w:t>
             </w:r>
           </w:p>
         </w:tc>
@@ -30938,7 +31054,319 @@
           <w:sz w:val="23"/>
           <w:szCs w:val="23"/>
         </w:rPr>
-        <w:t xml:space="preserve">[I-6] ★☆☆   6번 순이익 그래프와 16번 경제성 수치가 안 맞습니다.</w:t>
+        <w:t xml:space="preserve">[I-5] ★★☆   보고서 8장 안에서 메탄올 단가(520 vs 668.6 $/t), 연간 운항일(355 vs 250일), 편도 거리(1,652 vs 1,410 nm)가 절마다 다릅니다.</w:t>
+      </w:r>
+    </w:p>
+    <w:p>
+      <w:pPr>
+        <w:keepNext/>
+        <w:spacing w:after="80" w:line="300"/>
+      </w:pPr>
+      <w:r>
+        <w:rPr>
+          <w:rFonts w:ascii="Malgun Gothic" w:cs="Malgun Gothic" w:eastAsia="Malgun Gothic" w:hAnsi="Malgun Gothic"/>
+          <w:b/>
+          <w:bCs/>
+          <w:color w:val="595959"/>
+          <w:sz w:val="21"/>
+          <w:szCs w:val="21"/>
+        </w:rPr>
+        <w:t xml:space="preserve">의도  </w:t>
+      </w:r>
+      <w:r>
+        <w:rPr>
+          <w:rFonts w:ascii="Malgun Gothic" w:cs="Malgun Gothic" w:eastAsia="Malgun Gothic" w:hAnsi="Malgun Gothic"/>
+          <w:i/>
+          <w:iCs/>
+          <w:color w:val="595959"/>
+          <w:sz w:val="21"/>
+          <w:szCs w:val="21"/>
+        </w:rPr>
+        <w:t xml:space="preserve">로터세일 경제성(8.5~8.6절)과 선박 경제성(8.7절)이 다른 전제로 계산됐다. 꼼꼼한 심사위원이 찾아낸다.</w:t>
+      </w:r>
+    </w:p>
+    <w:tbl>
+      <w:tblPr>
+        <w:tblW w:type="dxa" w:w="9638"/>
+        <w:tblBorders>
+          <w:top w:val="single" w:color="auto" w:sz="4"/>
+          <w:left w:val="single" w:color="auto" w:sz="4"/>
+          <w:bottom w:val="single" w:color="auto" w:sz="4"/>
+          <w:right w:val="single" w:color="auto" w:sz="4"/>
+          <w:insideH w:val="single" w:color="auto" w:sz="4"/>
+          <w:insideV w:val="single" w:color="auto" w:sz="4"/>
+        </w:tblBorders>
+      </w:tblPr>
+      <w:tblGrid>
+        <w:gridCol w:w="9638"/>
+      </w:tblGrid>
+      <w:tr>
+        <w:trPr>
+          <w:cantSplit/>
+        </w:trPr>
+        <w:tc>
+          <w:tcPr>
+            <w:tcW w:type="dxa" w:w="9638"/>
+            <w:tcBorders>
+              <w:top w:val="single" w:color="BFC5D2" w:sz="4"/>
+              <w:left w:val="single" w:color="BFC5D2" w:sz="4"/>
+              <w:bottom w:val="single" w:color="BFC5D2" w:sz="4"/>
+              <w:right w:val="single" w:color="BFC5D2" w:sz="4"/>
+            </w:tcBorders>
+            <w:shd w:fill="F2F5FA" w:color="auto" w:val="clear"/>
+            <w:tcMar>
+              <w:top w:type="dxa" w:w="120"/>
+              <w:left w:type="dxa" w:w="180"/>
+              <w:bottom w:type="dxa" w:w="120"/>
+              <w:right w:type="dxa" w:w="180"/>
+            </w:tcMar>
+          </w:tcPr>
+          <w:p>
+            <w:pPr>
+              <w:spacing w:after="0" w:line="310"/>
+            </w:pPr>
+            <w:r>
+              <w:rPr>
+                <w:rFonts w:ascii="Malgun Gothic" w:cs="Malgun Gothic" w:eastAsia="Malgun Gothic" w:hAnsi="Malgun Gothic"/>
+                <w:b/>
+                <w:bCs/>
+                <w:color w:val="1F3864"/>
+                <w:sz w:val="21"/>
+                <w:szCs w:val="21"/>
+              </w:rPr>
+              <w:t xml:space="preserve">답변  </w:t>
+            </w:r>
+            <w:r>
+              <w:rPr>
+                <w:rFonts w:ascii="Malgun Gothic" w:cs="Malgun Gothic" w:eastAsia="Malgun Gothic" w:hAnsi="Malgun Gothic"/>
+                <w:color w:val="222222"/>
+                <w:sz w:val="21"/>
+                <w:szCs w:val="21"/>
+              </w:rPr>
+              <w:t xml:space="preserve">맞습니다. 로터세일 절과 선박 경제성 절이 다른 시점에 다른 전제로 작성되어 통일하지 못했습니다. 최종 경제성은 8.7절 전제, 즉 메탄올 520달러, 355일, 1,652해리가 기준입니다. 로터세일 절감액 92만 달러는 668달러 기준이라 520달러로 환산하면 약 72만 달러가 되며, 이 경우에도 로터세일 자체 회수기간은 2~5년 범위로 투자 타당성은 유지됩니다. 편집 단계에서 전제를 통일하지 못한 것은 보고서의 명확한 결함으로 인정합니다.</w:t>
+            </w:r>
+          </w:p>
+        </w:tc>
+      </w:tr>
+    </w:tbl>
+    <w:tbl>
+      <w:tblPr>
+        <w:tblW w:type="dxa" w:w="9638"/>
+        <w:tblBorders>
+          <w:top w:val="single" w:color="auto" w:sz="4"/>
+          <w:left w:val="single" w:color="auto" w:sz="4"/>
+          <w:bottom w:val="single" w:color="auto" w:sz="4"/>
+          <w:right w:val="single" w:color="auto" w:sz="4"/>
+          <w:insideH w:val="single" w:color="auto" w:sz="4"/>
+          <w:insideV w:val="single" w:color="auto" w:sz="4"/>
+        </w:tblBorders>
+      </w:tblPr>
+      <w:tblGrid>
+        <w:gridCol w:w="9638"/>
+      </w:tblGrid>
+      <w:tr>
+        <w:trPr>
+          <w:cantSplit/>
+        </w:trPr>
+        <w:tc>
+          <w:tcPr>
+            <w:tcW w:type="dxa" w:w="9638"/>
+            <w:tcBorders>
+              <w:top w:val="single" w:color="F0C36D" w:sz="4"/>
+              <w:left w:val="single" w:color="F0C36D" w:sz="4"/>
+              <w:bottom w:val="single" w:color="F0C36D" w:sz="4"/>
+              <w:right w:val="single" w:color="F0C36D" w:sz="4"/>
+            </w:tcBorders>
+            <w:shd w:fill="FFF4E5" w:color="auto" w:val="clear"/>
+            <w:tcMar>
+              <w:top w:type="dxa" w:w="120"/>
+              <w:left w:type="dxa" w:w="180"/>
+              <w:bottom w:type="dxa" w:w="120"/>
+              <w:right w:type="dxa" w:w="180"/>
+            </w:tcMar>
+          </w:tcPr>
+          <w:p>
+            <w:pPr>
+              <w:spacing w:after="0"/>
+            </w:pPr>
+            <w:r>
+              <w:rPr>
+                <w:rFonts w:ascii="Malgun Gothic" w:cs="Malgun Gothic" w:eastAsia="Malgun Gothic" w:hAnsi="Malgun Gothic"/>
+                <w:b/>
+                <w:bCs/>
+                <w:color w:val="C00000"/>
+                <w:sz w:val="21"/>
+                <w:szCs w:val="21"/>
+              </w:rPr>
+              <w:t xml:space="preserve">⚠ 주의  </w:t>
+            </w:r>
+            <w:r>
+              <w:rPr>
+                <w:rFonts w:ascii="Malgun Gothic" w:cs="Malgun Gothic" w:eastAsia="Malgun Gothic" w:hAnsi="Malgun Gothic"/>
+                <w:color w:val="222222"/>
+                <w:sz w:val="21"/>
+                <w:szCs w:val="21"/>
+              </w:rPr>
+              <w:t xml:space="preserve">1,376 t × 520 $ = 71.5만 달러. 이 숫자를 미리 계산해 두면 '알고 있었다'는 인상을 준다.</w:t>
+            </w:r>
+          </w:p>
+        </w:tc>
+      </w:tr>
+    </w:tbl>
+    <w:p>
+      <w:pPr>
+        <w:spacing w:after="100"/>
+      </w:pPr>
+      <w:r>
+        <w:rPr>
+          <w:rFonts w:ascii="Malgun Gothic" w:cs="Malgun Gothic" w:eastAsia="Malgun Gothic" w:hAnsi="Malgun Gothic"/>
+          <w:color w:val="222222"/>
+          <w:sz w:val="21"/>
+          <w:szCs w:val="21"/>
+        </w:rPr>
+        <w:t xml:space="preserve"/>
+      </w:r>
+    </w:p>
+    <w:p>
+      <w:pPr>
+        <w:pStyle w:val="Heading3"/>
+        <w:keepNext/>
+        <w:spacing w:after="80" w:before="200"/>
+      </w:pPr>
+      <w:r>
+        <w:rPr>
+          <w:rFonts w:ascii="Malgun Gothic" w:cs="Malgun Gothic" w:eastAsia="Malgun Gothic" w:hAnsi="Malgun Gothic"/>
+          <w:b/>
+          <w:bCs/>
+          <w:color w:val="1F3864"/>
+          <w:sz w:val="23"/>
+          <w:szCs w:val="23"/>
+        </w:rPr>
+        <w:t xml:space="preserve">[I-6] ★☆☆   메탄올 520달러/톤 가정은 타당합니까? 그린 메탄올이면요?</w:t>
+      </w:r>
+    </w:p>
+    <w:p>
+      <w:pPr>
+        <w:keepNext/>
+        <w:spacing w:after="80" w:line="300"/>
+      </w:pPr>
+      <w:r>
+        <w:rPr>
+          <w:rFonts w:ascii="Malgun Gothic" w:cs="Malgun Gothic" w:eastAsia="Malgun Gothic" w:hAnsi="Malgun Gothic"/>
+          <w:b/>
+          <w:bCs/>
+          <w:color w:val="595959"/>
+          <w:sz w:val="21"/>
+          <w:szCs w:val="21"/>
+        </w:rPr>
+        <w:t xml:space="preserve">의도  </w:t>
+      </w:r>
+      <w:r>
+        <w:rPr>
+          <w:rFonts w:ascii="Malgun Gothic" w:cs="Malgun Gothic" w:eastAsia="Malgun Gothic" w:hAnsi="Malgun Gothic"/>
+          <w:i/>
+          <w:iCs/>
+          <w:color w:val="595959"/>
+          <w:sz w:val="21"/>
+          <w:szCs w:val="21"/>
+        </w:rPr>
+        <w:t xml:space="preserve">연료가 가정.</w:t>
+      </w:r>
+    </w:p>
+    <w:tbl>
+      <w:tblPr>
+        <w:tblW w:type="dxa" w:w="9638"/>
+        <w:tblBorders>
+          <w:top w:val="single" w:color="auto" w:sz="4"/>
+          <w:left w:val="single" w:color="auto" w:sz="4"/>
+          <w:bottom w:val="single" w:color="auto" w:sz="4"/>
+          <w:right w:val="single" w:color="auto" w:sz="4"/>
+          <w:insideH w:val="single" w:color="auto" w:sz="4"/>
+          <w:insideV w:val="single" w:color="auto" w:sz="4"/>
+        </w:tblBorders>
+      </w:tblPr>
+      <w:tblGrid>
+        <w:gridCol w:w="9638"/>
+      </w:tblGrid>
+      <w:tr>
+        <w:trPr>
+          <w:cantSplit/>
+        </w:trPr>
+        <w:tc>
+          <w:tcPr>
+            <w:tcW w:type="dxa" w:w="9638"/>
+            <w:tcBorders>
+              <w:top w:val="single" w:color="BFC5D2" w:sz="4"/>
+              <w:left w:val="single" w:color="BFC5D2" w:sz="4"/>
+              <w:bottom w:val="single" w:color="BFC5D2" w:sz="4"/>
+              <w:right w:val="single" w:color="BFC5D2" w:sz="4"/>
+            </w:tcBorders>
+            <w:shd w:fill="F2F5FA" w:color="auto" w:val="clear"/>
+            <w:tcMar>
+              <w:top w:type="dxa" w:w="120"/>
+              <w:left w:type="dxa" w:w="180"/>
+              <w:bottom w:type="dxa" w:w="120"/>
+              <w:right w:type="dxa" w:w="180"/>
+            </w:tcMar>
+          </w:tcPr>
+          <w:p>
+            <w:pPr>
+              <w:spacing w:after="0" w:line="310"/>
+            </w:pPr>
+            <w:r>
+              <w:rPr>
+                <w:rFonts w:ascii="Malgun Gothic" w:cs="Malgun Gothic" w:eastAsia="Malgun Gothic" w:hAnsi="Malgun Gothic"/>
+                <w:b/>
+                <w:bCs/>
+                <w:color w:val="1F3864"/>
+                <w:sz w:val="21"/>
+                <w:szCs w:val="21"/>
+              </w:rPr>
+              <w:t xml:space="preserve">답변  </w:t>
+            </w:r>
+            <w:r>
+              <w:rPr>
+                <w:rFonts w:ascii="Malgun Gothic" w:cs="Malgun Gothic" w:eastAsia="Malgun Gothic" w:hAnsi="Malgun Gothic"/>
+                <w:color w:val="222222"/>
+                <w:sz w:val="21"/>
+                <w:szCs w:val="21"/>
+              </w:rPr>
+              <w:t xml:space="preserve">marinemethanol.com의 2026년 시세 기준 회색 메탄올 가격입니다. 바이오·e-메탄올은 톤당 1,000~1,500달러 수준으로 연료비가 2~3배가 되므로 규제 인센티브 없이는 경제성이 크게 달라집니다. 본 설계는 회색 메탄올로 시작해 공급망 전환에 따라 그린 연료로 옮기는 시나리오를 전제합니다.</w:t>
+            </w:r>
+          </w:p>
+        </w:tc>
+      </w:tr>
+    </w:tbl>
+    <w:p>
+      <w:pPr>
+        <w:spacing w:after="100"/>
+      </w:pPr>
+      <w:r>
+        <w:rPr>
+          <w:rFonts w:ascii="Malgun Gothic" w:cs="Malgun Gothic" w:eastAsia="Malgun Gothic" w:hAnsi="Malgun Gothic"/>
+          <w:color w:val="222222"/>
+          <w:sz w:val="21"/>
+          <w:szCs w:val="21"/>
+        </w:rPr>
+        <w:t xml:space="preserve"/>
+      </w:r>
+    </w:p>
+    <w:p>
+      <w:pPr>
+        <w:pStyle w:val="Heading3"/>
+        <w:keepNext/>
+        <w:spacing w:after="80" w:before="200"/>
+      </w:pPr>
+      <w:r>
+        <w:rPr>
+          <w:rFonts w:ascii="Malgun Gothic" w:cs="Malgun Gothic" w:eastAsia="Malgun Gothic" w:hAnsi="Malgun Gothic"/>
+          <w:b/>
+          <w:bCs/>
+          <w:color w:val="1F3864"/>
+          <w:sz w:val="23"/>
+          <w:szCs w:val="23"/>
+        </w:rPr>
+        <w:t xml:space="preserve">[I-7] ★☆☆   6번 순이익 그래프와 16번 경제성 수치가 안 맞습니다.</w:t>
       </w:r>
     </w:p>
     <w:p>
@@ -33520,7 +33948,7 @@
                 <w:sz w:val="17"/>
                 <w:szCs w:val="17"/>
               </w:rPr>
-              <w:t xml:space="preserve">0.81 → 3.1 → 7.7년 (TCE 3.5만 · 선가 66 M)</w:t>
+              <w:t xml:space="preserve">0.81 → 3.4 → 8.3년 · 8/28 WS197 39,600</w:t>
             </w:r>
           </w:p>
         </w:tc>
@@ -38022,7 +38450,81 @@
                 <w:sz w:val="18"/>
                 <w:szCs w:val="18"/>
               </w:rPr>
-              <w:t xml:space="preserve">TCE 35,000 → 3.1년 / + 시장 신조선가 66 M (LR1 55~70 M + MeOH 10%) → 7.7년 / TCE 15,000이면 15년+. 로터세일 자체 회수 1.4~3.7년 (연 0.92 M 절감)</w:t>
+              <w:t xml:space="preserve">TCE 33,000 (LR1 5년 평균) → 3.4년 / + 시장 신조선가 66 M (한국 60 M + MeOH 10%) → 8.3년 / TCE 16,600 (LR1 10년 평균)이면 27년+. 로터세일 자체 회수 1.4~3.7년 (연 0.92 M 절감)</w:t>
+            </w:r>
+          </w:p>
+        </w:tc>
+      </w:tr>
+      <w:tr>
+        <w:trPr>
+          <w:cantSplit/>
+          <w:tblHeader w:val="false"/>
+        </w:trPr>
+        <w:tc>
+          <w:tcPr>
+            <w:tcW w:type="dxa" w:w="2500"/>
+            <w:tcBorders>
+              <w:top w:val="single" w:color="9CA3AF" w:sz="4"/>
+              <w:left w:val="single" w:color="9CA3AF" w:sz="4"/>
+              <w:bottom w:val="single" w:color="9CA3AF" w:sz="4"/>
+              <w:right w:val="single" w:color="9CA3AF" w:sz="4"/>
+            </w:tcBorders>
+            <w:tcMar>
+              <w:top w:type="dxa" w:w="60"/>
+              <w:left w:type="dxa" w:w="100"/>
+              <w:bottom w:type="dxa" w:w="60"/>
+              <w:right w:type="dxa" w:w="100"/>
+            </w:tcMar>
+          </w:tcPr>
+          <w:p>
+            <w:pPr>
+              <w:spacing w:after="0" w:line="270"/>
+              <w:jc w:val="left"/>
+            </w:pPr>
+            <w:r>
+              <w:rPr>
+                <w:rFonts w:ascii="Malgun Gothic" w:cs="Malgun Gothic" w:eastAsia="Malgun Gothic" w:hAnsi="Malgun Gothic"/>
+                <w:b w:val="false"/>
+                <w:bCs w:val="false"/>
+                <w:color w:val="222222"/>
+                <w:sz w:val="18"/>
+                <w:szCs w:val="18"/>
+              </w:rPr>
+              <w:t xml:space="preserve">TD9 2026 흐름</w:t>
+            </w:r>
+          </w:p>
+        </w:tc>
+        <w:tc>
+          <w:tcPr>
+            <w:tcW w:type="dxa" w:w="7138"/>
+            <w:tcBorders>
+              <w:top w:val="single" w:color="9CA3AF" w:sz="4"/>
+              <w:left w:val="single" w:color="9CA3AF" w:sz="4"/>
+              <w:bottom w:val="single" w:color="9CA3AF" w:sz="4"/>
+              <w:right w:val="single" w:color="9CA3AF" w:sz="4"/>
+            </w:tcBorders>
+            <w:tcMar>
+              <w:top w:type="dxa" w:w="60"/>
+              <w:left w:type="dxa" w:w="100"/>
+              <w:bottom w:type="dxa" w:w="60"/>
+              <w:right w:type="dxa" w:w="100"/>
+            </w:tcMar>
+          </w:tcPr>
+          <w:p>
+            <w:pPr>
+              <w:spacing w:after="0" w:line="270"/>
+              <w:jc w:val="left"/>
+            </w:pPr>
+            <w:r>
+              <w:rPr>
+                <w:rFonts w:ascii="Malgun Gothic" w:cs="Malgun Gothic" w:eastAsia="Malgun Gothic" w:hAnsi="Malgun Gothic"/>
+                <w:b w:val="false"/>
+                <w:bCs w:val="false"/>
+                <w:color w:val="222222"/>
+                <w:sz w:val="18"/>
+                <w:szCs w:val="18"/>
+              </w:rPr>
+              <w:t xml:space="preserve">4/10 WS880 · 28.6만 (호르무즈) → 7/24 WS459 · 13.6만 → 8/21 WS373 · 10.4만 (보고서) → 8/28 WS197 · 3.96만 → 9/4 WS227 · 4.86만. 2025: 1.5만~5만</w:t>
             </w:r>
           </w:p>
         </w:tc>

</xml_diff>

<commit_message>
Add six rotor-sail Q&A items to the presentation Q&A document
Co-Authored-By: Claude Fable 5.1 <noreply@anthropic.com>
Claude-Session: https://claude.ai/code/session_01KYxRjEufxoxoFhSS4GKPUN
</commit_message>
<xml_diff>
--- a/contest/presentation/2026_74K_발표대본_질의응답.docx
+++ b/contest/presentation/2026_74K_발표대본_질의응답.docx
@@ -19163,11 +19163,11 @@
                 <w:rFonts w:ascii="Malgun Gothic" w:cs="Malgun Gothic" w:eastAsia="Malgun Gothic" w:hAnsi="Malgun Gothic"/>
                 <w:b w:val="false"/>
                 <w:bCs w:val="false"/>
-                <w:color w:val="222222"/>
-                <w:sz w:val="17"/>
-                <w:szCs w:val="17"/>
-              </w:rPr>
-              <w:t xml:space="preserve">★☆☆</w:t>
+                <w:color w:val="C00000"/>
+                <w:sz w:val="17"/>
+                <w:szCs w:val="17"/>
+              </w:rPr>
+              <w:t xml:space="preserve">★★★</w:t>
             </w:r>
           </w:p>
         </w:tc>
@@ -19201,7 +19201,7 @@
                 <w:sz w:val="17"/>
                 <w:szCs w:val="17"/>
               </w:rPr>
-              <w:t xml:space="preserve">축발전기만으로 EEDI가 4.411에서 3.580으로 내려가는 이유는?</w:t>
+              <w:t xml:space="preserve">추력은 총저항의 12.2%인데 제동마력 절감은 8.8%입니다. 왜 다릅니까?</w:t>
             </w:r>
           </w:p>
         </w:tc>
@@ -19339,6 +19339,534 @@
                 <w:rFonts w:ascii="Malgun Gothic" w:cs="Malgun Gothic" w:eastAsia="Malgun Gothic" w:hAnsi="Malgun Gothic"/>
                 <w:b w:val="false"/>
                 <w:bCs w:val="false"/>
+                <w:color w:val="C00000"/>
+                <w:sz w:val="17"/>
+                <w:szCs w:val="17"/>
+              </w:rPr>
+              <w:t xml:space="preserve">★★★</w:t>
+            </w:r>
+          </w:p>
+        </w:tc>
+        <w:tc>
+          <w:tcPr>
+            <w:tcW w:type="dxa" w:w="6238"/>
+            <w:tcBorders>
+              <w:top w:val="single" w:color="9CA3AF" w:sz="4"/>
+              <w:left w:val="single" w:color="9CA3AF" w:sz="4"/>
+              <w:bottom w:val="single" w:color="9CA3AF" w:sz="4"/>
+              <w:right w:val="single" w:color="9CA3AF" w:sz="4"/>
+            </w:tcBorders>
+            <w:tcMar>
+              <w:top w:type="dxa" w:w="60"/>
+              <w:left w:type="dxa" w:w="100"/>
+              <w:bottom w:type="dxa" w:w="60"/>
+              <w:right w:type="dxa" w:w="100"/>
+            </w:tcMar>
+          </w:tcPr>
+          <w:p>
+            <w:pPr>
+              <w:spacing w:after="0" w:line="270"/>
+              <w:jc w:val="left"/>
+            </w:pPr>
+            <w:r>
+              <w:rPr>
+                <w:rFonts w:ascii="Malgun Gothic" w:cs="Malgun Gothic" w:eastAsia="Malgun Gothic" w:hAnsi="Malgun Gothic"/>
+                <w:b w:val="false"/>
+                <w:bCs w:val="false"/>
+                <w:color w:val="222222"/>
+                <w:sz w:val="17"/>
+                <w:szCs w:val="17"/>
+              </w:rPr>
+              <w:t xml:space="preserve">로터세일 구동 전력(115 kW × 3기)은 절감량에서 뺐습니까?</w:t>
+            </w:r>
+          </w:p>
+        </w:tc>
+        <w:tc>
+          <w:tcPr>
+            <w:tcW w:type="dxa" w:w="1000"/>
+            <w:tcBorders>
+              <w:top w:val="single" w:color="9CA3AF" w:sz="4"/>
+              <w:left w:val="single" w:color="9CA3AF" w:sz="4"/>
+              <w:bottom w:val="single" w:color="9CA3AF" w:sz="4"/>
+              <w:right w:val="single" w:color="9CA3AF" w:sz="4"/>
+            </w:tcBorders>
+            <w:tcMar>
+              <w:top w:type="dxa" w:w="60"/>
+              <w:left w:type="dxa" w:w="100"/>
+              <w:bottom w:type="dxa" w:w="60"/>
+              <w:right w:type="dxa" w:w="100"/>
+            </w:tcMar>
+          </w:tcPr>
+          <w:p>
+            <w:pPr>
+              <w:spacing w:after="0" w:line="270"/>
+              <w:jc w:val="left"/>
+            </w:pPr>
+            <w:r>
+              <w:rPr>
+                <w:rFonts w:ascii="Malgun Gothic" w:cs="Malgun Gothic" w:eastAsia="Malgun Gothic" w:hAnsi="Malgun Gothic"/>
+                <w:b w:val="false"/>
+                <w:bCs w:val="false"/>
+                <w:color w:val="222222"/>
+                <w:sz w:val="17"/>
+                <w:szCs w:val="17"/>
+              </w:rPr>
+              <w:t xml:space="preserve">H-6</w:t>
+            </w:r>
+          </w:p>
+        </w:tc>
+        <w:tc>
+          <w:tcPr>
+            <w:tcW w:type="dxa" w:w="800"/>
+            <w:tcBorders>
+              <w:top w:val="single" w:color="9CA3AF" w:sz="4"/>
+              <w:left w:val="single" w:color="9CA3AF" w:sz="4"/>
+              <w:bottom w:val="single" w:color="9CA3AF" w:sz="4"/>
+              <w:right w:val="single" w:color="9CA3AF" w:sz="4"/>
+            </w:tcBorders>
+            <w:tcMar>
+              <w:top w:type="dxa" w:w="60"/>
+              <w:left w:type="dxa" w:w="100"/>
+              <w:bottom w:type="dxa" w:w="60"/>
+              <w:right w:type="dxa" w:w="100"/>
+            </w:tcMar>
+          </w:tcPr>
+          <w:p>
+            <w:pPr>
+              <w:spacing w:after="0" w:line="270"/>
+              <w:jc w:val="left"/>
+            </w:pPr>
+            <w:r>
+              <w:rPr>
+                <w:rFonts w:ascii="Malgun Gothic" w:cs="Malgun Gothic" w:eastAsia="Malgun Gothic" w:hAnsi="Malgun Gothic"/>
+                <w:b w:val="false"/>
+                <w:bCs w:val="false"/>
+                <w:color w:val="222222"/>
+                <w:sz w:val="17"/>
+                <w:szCs w:val="17"/>
+              </w:rPr>
+              <w:t xml:space="preserve"/>
+            </w:r>
+          </w:p>
+        </w:tc>
+      </w:tr>
+      <w:tr>
+        <w:trPr>
+          <w:cantSplit/>
+          <w:tblHeader w:val="false"/>
+        </w:trPr>
+        <w:tc>
+          <w:tcPr>
+            <w:tcW w:type="dxa" w:w="700"/>
+            <w:tcBorders>
+              <w:top w:val="single" w:color="9CA3AF" w:sz="4"/>
+              <w:left w:val="single" w:color="9CA3AF" w:sz="4"/>
+              <w:bottom w:val="single" w:color="9CA3AF" w:sz="4"/>
+              <w:right w:val="single" w:color="9CA3AF" w:sz="4"/>
+            </w:tcBorders>
+            <w:tcMar>
+              <w:top w:type="dxa" w:w="60"/>
+              <w:left w:type="dxa" w:w="100"/>
+              <w:bottom w:type="dxa" w:w="60"/>
+              <w:right w:type="dxa" w:w="100"/>
+            </w:tcMar>
+          </w:tcPr>
+          <w:p>
+            <w:pPr>
+              <w:spacing w:after="0" w:line="270"/>
+              <w:jc w:val="left"/>
+            </w:pPr>
+            <w:r>
+              <w:rPr>
+                <w:rFonts w:ascii="Malgun Gothic" w:cs="Malgun Gothic" w:eastAsia="Malgun Gothic" w:hAnsi="Malgun Gothic"/>
+                <w:b/>
+                <w:bCs/>
+                <w:color w:val="222222"/>
+                <w:sz w:val="17"/>
+                <w:szCs w:val="17"/>
+              </w:rPr>
+              <w:t xml:space="preserve">H-7</w:t>
+            </w:r>
+          </w:p>
+        </w:tc>
+        <w:tc>
+          <w:tcPr>
+            <w:tcW w:type="dxa" w:w="900"/>
+            <w:tcBorders>
+              <w:top w:val="single" w:color="9CA3AF" w:sz="4"/>
+              <w:left w:val="single" w:color="9CA3AF" w:sz="4"/>
+              <w:bottom w:val="single" w:color="9CA3AF" w:sz="4"/>
+              <w:right w:val="single" w:color="9CA3AF" w:sz="4"/>
+            </w:tcBorders>
+            <w:tcMar>
+              <w:top w:type="dxa" w:w="60"/>
+              <w:left w:type="dxa" w:w="100"/>
+              <w:bottom w:type="dxa" w:w="60"/>
+              <w:right w:type="dxa" w:w="100"/>
+            </w:tcMar>
+          </w:tcPr>
+          <w:p>
+            <w:pPr>
+              <w:spacing w:after="0" w:line="270"/>
+              <w:jc w:val="left"/>
+            </w:pPr>
+            <w:r>
+              <w:rPr>
+                <w:rFonts w:ascii="Malgun Gothic" w:cs="Malgun Gothic" w:eastAsia="Malgun Gothic" w:hAnsi="Malgun Gothic"/>
+                <w:b w:val="false"/>
+                <w:bCs w:val="false"/>
+                <w:color w:val="222222"/>
+                <w:sz w:val="17"/>
+                <w:szCs w:val="17"/>
+              </w:rPr>
+              <w:t xml:space="preserve">★★☆</w:t>
+            </w:r>
+          </w:p>
+        </w:tc>
+        <w:tc>
+          <w:tcPr>
+            <w:tcW w:type="dxa" w:w="6238"/>
+            <w:tcBorders>
+              <w:top w:val="single" w:color="9CA3AF" w:sz="4"/>
+              <w:left w:val="single" w:color="9CA3AF" w:sz="4"/>
+              <w:bottom w:val="single" w:color="9CA3AF" w:sz="4"/>
+              <w:right w:val="single" w:color="9CA3AF" w:sz="4"/>
+            </w:tcBorders>
+            <w:tcMar>
+              <w:top w:type="dxa" w:w="60"/>
+              <w:left w:type="dxa" w:w="100"/>
+              <w:bottom w:type="dxa" w:w="60"/>
+              <w:right w:type="dxa" w:w="100"/>
+            </w:tcMar>
+          </w:tcPr>
+          <w:p>
+            <w:pPr>
+              <w:spacing w:after="0" w:line="270"/>
+              <w:jc w:val="left"/>
+            </w:pPr>
+            <w:r>
+              <w:rPr>
+                <w:rFonts w:ascii="Malgun Gothic" w:cs="Malgun Gothic" w:eastAsia="Malgun Gothic" w:hAnsi="Malgun Gothic"/>
+                <w:b w:val="false"/>
+                <w:bCs w:val="false"/>
+                <w:color w:val="222222"/>
+                <w:sz w:val="17"/>
+                <w:szCs w:val="17"/>
+              </w:rPr>
+              <w:t xml:space="preserve">Norsepower 카탈로그 최대추력은 205 kN인데 계산된 추력은 기당 27 kN입니다. 너무 작지 않습니까?</w:t>
+            </w:r>
+          </w:p>
+        </w:tc>
+        <w:tc>
+          <w:tcPr>
+            <w:tcW w:type="dxa" w:w="1000"/>
+            <w:tcBorders>
+              <w:top w:val="single" w:color="9CA3AF" w:sz="4"/>
+              <w:left w:val="single" w:color="9CA3AF" w:sz="4"/>
+              <w:bottom w:val="single" w:color="9CA3AF" w:sz="4"/>
+              <w:right w:val="single" w:color="9CA3AF" w:sz="4"/>
+            </w:tcBorders>
+            <w:tcMar>
+              <w:top w:type="dxa" w:w="60"/>
+              <w:left w:type="dxa" w:w="100"/>
+              <w:bottom w:type="dxa" w:w="60"/>
+              <w:right w:type="dxa" w:w="100"/>
+            </w:tcMar>
+          </w:tcPr>
+          <w:p>
+            <w:pPr>
+              <w:spacing w:after="0" w:line="270"/>
+              <w:jc w:val="left"/>
+            </w:pPr>
+            <w:r>
+              <w:rPr>
+                <w:rFonts w:ascii="Malgun Gothic" w:cs="Malgun Gothic" w:eastAsia="Malgun Gothic" w:hAnsi="Malgun Gothic"/>
+                <w:b w:val="false"/>
+                <w:bCs w:val="false"/>
+                <w:color w:val="222222"/>
+                <w:sz w:val="17"/>
+                <w:szCs w:val="17"/>
+              </w:rPr>
+              <w:t xml:space="preserve">H-7</w:t>
+            </w:r>
+          </w:p>
+        </w:tc>
+        <w:tc>
+          <w:tcPr>
+            <w:tcW w:type="dxa" w:w="800"/>
+            <w:tcBorders>
+              <w:top w:val="single" w:color="9CA3AF" w:sz="4"/>
+              <w:left w:val="single" w:color="9CA3AF" w:sz="4"/>
+              <w:bottom w:val="single" w:color="9CA3AF" w:sz="4"/>
+              <w:right w:val="single" w:color="9CA3AF" w:sz="4"/>
+            </w:tcBorders>
+            <w:tcMar>
+              <w:top w:type="dxa" w:w="60"/>
+              <w:left w:type="dxa" w:w="100"/>
+              <w:bottom w:type="dxa" w:w="60"/>
+              <w:right w:type="dxa" w:w="100"/>
+            </w:tcMar>
+          </w:tcPr>
+          <w:p>
+            <w:pPr>
+              <w:spacing w:after="0" w:line="270"/>
+              <w:jc w:val="left"/>
+            </w:pPr>
+            <w:r>
+              <w:rPr>
+                <w:rFonts w:ascii="Malgun Gothic" w:cs="Malgun Gothic" w:eastAsia="Malgun Gothic" w:hAnsi="Malgun Gothic"/>
+                <w:b w:val="false"/>
+                <w:bCs w:val="false"/>
+                <w:color w:val="222222"/>
+                <w:sz w:val="17"/>
+                <w:szCs w:val="17"/>
+              </w:rPr>
+              <w:t xml:space="preserve"/>
+            </w:r>
+          </w:p>
+        </w:tc>
+      </w:tr>
+      <w:tr>
+        <w:trPr>
+          <w:cantSplit/>
+          <w:tblHeader w:val="false"/>
+        </w:trPr>
+        <w:tc>
+          <w:tcPr>
+            <w:tcW w:type="dxa" w:w="700"/>
+            <w:tcBorders>
+              <w:top w:val="single" w:color="9CA3AF" w:sz="4"/>
+              <w:left w:val="single" w:color="9CA3AF" w:sz="4"/>
+              <w:bottom w:val="single" w:color="9CA3AF" w:sz="4"/>
+              <w:right w:val="single" w:color="9CA3AF" w:sz="4"/>
+            </w:tcBorders>
+            <w:tcMar>
+              <w:top w:type="dxa" w:w="60"/>
+              <w:left w:type="dxa" w:w="100"/>
+              <w:bottom w:type="dxa" w:w="60"/>
+              <w:right w:type="dxa" w:w="100"/>
+            </w:tcMar>
+          </w:tcPr>
+          <w:p>
+            <w:pPr>
+              <w:spacing w:after="0" w:line="270"/>
+              <w:jc w:val="left"/>
+            </w:pPr>
+            <w:r>
+              <w:rPr>
+                <w:rFonts w:ascii="Malgun Gothic" w:cs="Malgun Gothic" w:eastAsia="Malgun Gothic" w:hAnsi="Malgun Gothic"/>
+                <w:b/>
+                <w:bCs/>
+                <w:color w:val="222222"/>
+                <w:sz w:val="17"/>
+                <w:szCs w:val="17"/>
+              </w:rPr>
+              <w:t xml:space="preserve">H-8</w:t>
+            </w:r>
+          </w:p>
+        </w:tc>
+        <w:tc>
+          <w:tcPr>
+            <w:tcW w:type="dxa" w:w="900"/>
+            <w:tcBorders>
+              <w:top w:val="single" w:color="9CA3AF" w:sz="4"/>
+              <w:left w:val="single" w:color="9CA3AF" w:sz="4"/>
+              <w:bottom w:val="single" w:color="9CA3AF" w:sz="4"/>
+              <w:right w:val="single" w:color="9CA3AF" w:sz="4"/>
+            </w:tcBorders>
+            <w:tcMar>
+              <w:top w:type="dxa" w:w="60"/>
+              <w:left w:type="dxa" w:w="100"/>
+              <w:bottom w:type="dxa" w:w="60"/>
+              <w:right w:type="dxa" w:w="100"/>
+            </w:tcMar>
+          </w:tcPr>
+          <w:p>
+            <w:pPr>
+              <w:spacing w:after="0" w:line="270"/>
+              <w:jc w:val="left"/>
+            </w:pPr>
+            <w:r>
+              <w:rPr>
+                <w:rFonts w:ascii="Malgun Gothic" w:cs="Malgun Gothic" w:eastAsia="Malgun Gothic" w:hAnsi="Malgun Gothic"/>
+                <w:b w:val="false"/>
+                <w:bCs w:val="false"/>
+                <w:color w:val="222222"/>
+                <w:sz w:val="17"/>
+                <w:szCs w:val="17"/>
+              </w:rPr>
+              <w:t xml:space="preserve">★★☆</w:t>
+            </w:r>
+          </w:p>
+        </w:tc>
+        <w:tc>
+          <w:tcPr>
+            <w:tcW w:type="dxa" w:w="6238"/>
+            <w:tcBorders>
+              <w:top w:val="single" w:color="9CA3AF" w:sz="4"/>
+              <w:left w:val="single" w:color="9CA3AF" w:sz="4"/>
+              <w:bottom w:val="single" w:color="9CA3AF" w:sz="4"/>
+              <w:right w:val="single" w:color="9CA3AF" w:sz="4"/>
+            </w:tcBorders>
+            <w:tcMar>
+              <w:top w:type="dxa" w:w="60"/>
+              <w:left w:type="dxa" w:w="100"/>
+              <w:bottom w:type="dxa" w:w="60"/>
+              <w:right w:type="dxa" w:w="100"/>
+            </w:tcMar>
+          </w:tcPr>
+          <w:p>
+            <w:pPr>
+              <w:spacing w:after="0" w:line="270"/>
+              <w:jc w:val="left"/>
+            </w:pPr>
+            <w:r>
+              <w:rPr>
+                <w:rFonts w:ascii="Malgun Gothic" w:cs="Malgun Gothic" w:eastAsia="Malgun Gothic" w:hAnsi="Malgun Gothic"/>
+                <w:b w:val="false"/>
+                <w:bCs w:val="false"/>
+                <w:color w:val="222222"/>
+                <w:sz w:val="17"/>
+                <w:szCs w:val="17"/>
+              </w:rPr>
+              <w:t xml:space="preserve">실선 대조표에서 Jones et al.은 2.03%밖에 안 되는데 8.8%가 타당합니까?</w:t>
+            </w:r>
+          </w:p>
+        </w:tc>
+        <w:tc>
+          <w:tcPr>
+            <w:tcW w:type="dxa" w:w="1000"/>
+            <w:tcBorders>
+              <w:top w:val="single" w:color="9CA3AF" w:sz="4"/>
+              <w:left w:val="single" w:color="9CA3AF" w:sz="4"/>
+              <w:bottom w:val="single" w:color="9CA3AF" w:sz="4"/>
+              <w:right w:val="single" w:color="9CA3AF" w:sz="4"/>
+            </w:tcBorders>
+            <w:tcMar>
+              <w:top w:type="dxa" w:w="60"/>
+              <w:left w:type="dxa" w:w="100"/>
+              <w:bottom w:type="dxa" w:w="60"/>
+              <w:right w:type="dxa" w:w="100"/>
+            </w:tcMar>
+          </w:tcPr>
+          <w:p>
+            <w:pPr>
+              <w:spacing w:after="0" w:line="270"/>
+              <w:jc w:val="left"/>
+            </w:pPr>
+            <w:r>
+              <w:rPr>
+                <w:rFonts w:ascii="Malgun Gothic" w:cs="Malgun Gothic" w:eastAsia="Malgun Gothic" w:hAnsi="Malgun Gothic"/>
+                <w:b w:val="false"/>
+                <w:bCs w:val="false"/>
+                <w:color w:val="222222"/>
+                <w:sz w:val="17"/>
+                <w:szCs w:val="17"/>
+              </w:rPr>
+              <w:t xml:space="preserve">H-8</w:t>
+            </w:r>
+          </w:p>
+        </w:tc>
+        <w:tc>
+          <w:tcPr>
+            <w:tcW w:type="dxa" w:w="800"/>
+            <w:tcBorders>
+              <w:top w:val="single" w:color="9CA3AF" w:sz="4"/>
+              <w:left w:val="single" w:color="9CA3AF" w:sz="4"/>
+              <w:bottom w:val="single" w:color="9CA3AF" w:sz="4"/>
+              <w:right w:val="single" w:color="9CA3AF" w:sz="4"/>
+            </w:tcBorders>
+            <w:tcMar>
+              <w:top w:type="dxa" w:w="60"/>
+              <w:left w:type="dxa" w:w="100"/>
+              <w:bottom w:type="dxa" w:w="60"/>
+              <w:right w:type="dxa" w:w="100"/>
+            </w:tcMar>
+          </w:tcPr>
+          <w:p>
+            <w:pPr>
+              <w:spacing w:after="0" w:line="270"/>
+              <w:jc w:val="left"/>
+            </w:pPr>
+            <w:r>
+              <w:rPr>
+                <w:rFonts w:ascii="Malgun Gothic" w:cs="Malgun Gothic" w:eastAsia="Malgun Gothic" w:hAnsi="Malgun Gothic"/>
+                <w:b w:val="false"/>
+                <w:bCs w:val="false"/>
+                <w:color w:val="222222"/>
+                <w:sz w:val="17"/>
+                <w:szCs w:val="17"/>
+              </w:rPr>
+              <w:t xml:space="preserve"/>
+            </w:r>
+          </w:p>
+        </w:tc>
+      </w:tr>
+      <w:tr>
+        <w:trPr>
+          <w:cantSplit/>
+          <w:tblHeader w:val="false"/>
+        </w:trPr>
+        <w:tc>
+          <w:tcPr>
+            <w:tcW w:type="dxa" w:w="700"/>
+            <w:tcBorders>
+              <w:top w:val="single" w:color="9CA3AF" w:sz="4"/>
+              <w:left w:val="single" w:color="9CA3AF" w:sz="4"/>
+              <w:bottom w:val="single" w:color="9CA3AF" w:sz="4"/>
+              <w:right w:val="single" w:color="9CA3AF" w:sz="4"/>
+            </w:tcBorders>
+            <w:tcMar>
+              <w:top w:type="dxa" w:w="60"/>
+              <w:left w:type="dxa" w:w="100"/>
+              <w:bottom w:type="dxa" w:w="60"/>
+              <w:right w:type="dxa" w:w="100"/>
+            </w:tcMar>
+          </w:tcPr>
+          <w:p>
+            <w:pPr>
+              <w:spacing w:after="0" w:line="270"/>
+              <w:jc w:val="left"/>
+            </w:pPr>
+            <w:r>
+              <w:rPr>
+                <w:rFonts w:ascii="Malgun Gothic" w:cs="Malgun Gothic" w:eastAsia="Malgun Gothic" w:hAnsi="Malgun Gothic"/>
+                <w:b/>
+                <w:bCs/>
+                <w:color w:val="222222"/>
+                <w:sz w:val="17"/>
+                <w:szCs w:val="17"/>
+              </w:rPr>
+              <w:t xml:space="preserve">H-9</w:t>
+            </w:r>
+          </w:p>
+        </w:tc>
+        <w:tc>
+          <w:tcPr>
+            <w:tcW w:type="dxa" w:w="900"/>
+            <w:tcBorders>
+              <w:top w:val="single" w:color="9CA3AF" w:sz="4"/>
+              <w:left w:val="single" w:color="9CA3AF" w:sz="4"/>
+              <w:bottom w:val="single" w:color="9CA3AF" w:sz="4"/>
+              <w:right w:val="single" w:color="9CA3AF" w:sz="4"/>
+            </w:tcBorders>
+            <w:tcMar>
+              <w:top w:type="dxa" w:w="60"/>
+              <w:left w:type="dxa" w:w="100"/>
+              <w:bottom w:type="dxa" w:w="60"/>
+              <w:right w:type="dxa" w:w="100"/>
+            </w:tcMar>
+          </w:tcPr>
+          <w:p>
+            <w:pPr>
+              <w:spacing w:after="0" w:line="270"/>
+              <w:jc w:val="left"/>
+            </w:pPr>
+            <w:r>
+              <w:rPr>
+                <w:rFonts w:ascii="Malgun Gothic" w:cs="Malgun Gothic" w:eastAsia="Malgun Gothic" w:hAnsi="Malgun Gothic"/>
+                <w:b w:val="false"/>
+                <w:bCs w:val="false"/>
                 <w:color w:val="222222"/>
                 <w:sz w:val="17"/>
                 <w:szCs w:val="17"/>
@@ -19377,6 +19905,534 @@
                 <w:sz w:val="17"/>
                 <w:szCs w:val="17"/>
               </w:rPr>
+              <w:t xml:space="preserve">8.6절의 연간 연료비 1,040만 달러는 어디서 나온 값입니까? 8.7절 항해비와 다른데요.</w:t>
+            </w:r>
+          </w:p>
+        </w:tc>
+        <w:tc>
+          <w:tcPr>
+            <w:tcW w:type="dxa" w:w="1000"/>
+            <w:tcBorders>
+              <w:top w:val="single" w:color="9CA3AF" w:sz="4"/>
+              <w:left w:val="single" w:color="9CA3AF" w:sz="4"/>
+              <w:bottom w:val="single" w:color="9CA3AF" w:sz="4"/>
+              <w:right w:val="single" w:color="9CA3AF" w:sz="4"/>
+            </w:tcBorders>
+            <w:tcMar>
+              <w:top w:type="dxa" w:w="60"/>
+              <w:left w:type="dxa" w:w="100"/>
+              <w:bottom w:type="dxa" w:w="60"/>
+              <w:right w:type="dxa" w:w="100"/>
+            </w:tcMar>
+          </w:tcPr>
+          <w:p>
+            <w:pPr>
+              <w:spacing w:after="0" w:line="270"/>
+              <w:jc w:val="left"/>
+            </w:pPr>
+            <w:r>
+              <w:rPr>
+                <w:rFonts w:ascii="Malgun Gothic" w:cs="Malgun Gothic" w:eastAsia="Malgun Gothic" w:hAnsi="Malgun Gothic"/>
+                <w:b w:val="false"/>
+                <w:bCs w:val="false"/>
+                <w:color w:val="222222"/>
+                <w:sz w:val="17"/>
+                <w:szCs w:val="17"/>
+              </w:rPr>
+              <w:t xml:space="preserve">H-9</w:t>
+            </w:r>
+          </w:p>
+        </w:tc>
+        <w:tc>
+          <w:tcPr>
+            <w:tcW w:type="dxa" w:w="800"/>
+            <w:tcBorders>
+              <w:top w:val="single" w:color="9CA3AF" w:sz="4"/>
+              <w:left w:val="single" w:color="9CA3AF" w:sz="4"/>
+              <w:bottom w:val="single" w:color="9CA3AF" w:sz="4"/>
+              <w:right w:val="single" w:color="9CA3AF" w:sz="4"/>
+            </w:tcBorders>
+            <w:tcMar>
+              <w:top w:type="dxa" w:w="60"/>
+              <w:left w:type="dxa" w:w="100"/>
+              <w:bottom w:type="dxa" w:w="60"/>
+              <w:right w:type="dxa" w:w="100"/>
+            </w:tcMar>
+          </w:tcPr>
+          <w:p>
+            <w:pPr>
+              <w:spacing w:after="0" w:line="270"/>
+              <w:jc w:val="left"/>
+            </w:pPr>
+            <w:r>
+              <w:rPr>
+                <w:rFonts w:ascii="Malgun Gothic" w:cs="Malgun Gothic" w:eastAsia="Malgun Gothic" w:hAnsi="Malgun Gothic"/>
+                <w:b w:val="false"/>
+                <w:bCs w:val="false"/>
+                <w:color w:val="222222"/>
+                <w:sz w:val="17"/>
+                <w:szCs w:val="17"/>
+              </w:rPr>
+              <w:t xml:space="preserve"/>
+            </w:r>
+          </w:p>
+        </w:tc>
+      </w:tr>
+      <w:tr>
+        <w:trPr>
+          <w:cantSplit/>
+          <w:tblHeader w:val="false"/>
+        </w:trPr>
+        <w:tc>
+          <w:tcPr>
+            <w:tcW w:type="dxa" w:w="700"/>
+            <w:tcBorders>
+              <w:top w:val="single" w:color="9CA3AF" w:sz="4"/>
+              <w:left w:val="single" w:color="9CA3AF" w:sz="4"/>
+              <w:bottom w:val="single" w:color="9CA3AF" w:sz="4"/>
+              <w:right w:val="single" w:color="9CA3AF" w:sz="4"/>
+            </w:tcBorders>
+            <w:tcMar>
+              <w:top w:type="dxa" w:w="60"/>
+              <w:left w:type="dxa" w:w="100"/>
+              <w:bottom w:type="dxa" w:w="60"/>
+              <w:right w:type="dxa" w:w="100"/>
+            </w:tcMar>
+          </w:tcPr>
+          <w:p>
+            <w:pPr>
+              <w:spacing w:after="0" w:line="270"/>
+              <w:jc w:val="left"/>
+            </w:pPr>
+            <w:r>
+              <w:rPr>
+                <w:rFonts w:ascii="Malgun Gothic" w:cs="Malgun Gothic" w:eastAsia="Malgun Gothic" w:hAnsi="Malgun Gothic"/>
+                <w:b/>
+                <w:bCs/>
+                <w:color w:val="222222"/>
+                <w:sz w:val="17"/>
+                <w:szCs w:val="17"/>
+              </w:rPr>
+              <w:t xml:space="preserve">H-10</w:t>
+            </w:r>
+          </w:p>
+        </w:tc>
+        <w:tc>
+          <w:tcPr>
+            <w:tcW w:type="dxa" w:w="900"/>
+            <w:tcBorders>
+              <w:top w:val="single" w:color="9CA3AF" w:sz="4"/>
+              <w:left w:val="single" w:color="9CA3AF" w:sz="4"/>
+              <w:bottom w:val="single" w:color="9CA3AF" w:sz="4"/>
+              <w:right w:val="single" w:color="9CA3AF" w:sz="4"/>
+            </w:tcBorders>
+            <w:tcMar>
+              <w:top w:type="dxa" w:w="60"/>
+              <w:left w:type="dxa" w:w="100"/>
+              <w:bottom w:type="dxa" w:w="60"/>
+              <w:right w:type="dxa" w:w="100"/>
+            </w:tcMar>
+          </w:tcPr>
+          <w:p>
+            <w:pPr>
+              <w:spacing w:after="0" w:line="270"/>
+              <w:jc w:val="left"/>
+            </w:pPr>
+            <w:r>
+              <w:rPr>
+                <w:rFonts w:ascii="Malgun Gothic" w:cs="Malgun Gothic" w:eastAsia="Malgun Gothic" w:hAnsi="Malgun Gothic"/>
+                <w:b w:val="false"/>
+                <w:bCs w:val="false"/>
+                <w:color w:val="222222"/>
+                <w:sz w:val="17"/>
+                <w:szCs w:val="17"/>
+              </w:rPr>
+              <w:t xml:space="preserve">★☆☆</w:t>
+            </w:r>
+          </w:p>
+        </w:tc>
+        <w:tc>
+          <w:tcPr>
+            <w:tcW w:type="dxa" w:w="6238"/>
+            <w:tcBorders>
+              <w:top w:val="single" w:color="9CA3AF" w:sz="4"/>
+              <w:left w:val="single" w:color="9CA3AF" w:sz="4"/>
+              <w:bottom w:val="single" w:color="9CA3AF" w:sz="4"/>
+              <w:right w:val="single" w:color="9CA3AF" w:sz="4"/>
+            </w:tcBorders>
+            <w:tcMar>
+              <w:top w:type="dxa" w:w="60"/>
+              <w:left w:type="dxa" w:w="100"/>
+              <w:bottom w:type="dxa" w:w="60"/>
+              <w:right w:type="dxa" w:w="100"/>
+            </w:tcMar>
+          </w:tcPr>
+          <w:p>
+            <w:pPr>
+              <w:spacing w:after="0" w:line="270"/>
+              <w:jc w:val="left"/>
+            </w:pPr>
+            <w:r>
+              <w:rPr>
+                <w:rFonts w:ascii="Malgun Gothic" w:cs="Malgun Gothic" w:eastAsia="Malgun Gothic" w:hAnsi="Malgun Gothic"/>
+                <w:b w:val="false"/>
+                <w:bCs w:val="false"/>
+                <w:color w:val="222222"/>
+                <w:sz w:val="17"/>
+                <w:szCs w:val="17"/>
+              </w:rPr>
+              <w:t xml:space="preserve">로터세일 유지비를 CAPEX의 5%/년으로 잡은 근거는?</w:t>
+            </w:r>
+          </w:p>
+        </w:tc>
+        <w:tc>
+          <w:tcPr>
+            <w:tcW w:type="dxa" w:w="1000"/>
+            <w:tcBorders>
+              <w:top w:val="single" w:color="9CA3AF" w:sz="4"/>
+              <w:left w:val="single" w:color="9CA3AF" w:sz="4"/>
+              <w:bottom w:val="single" w:color="9CA3AF" w:sz="4"/>
+              <w:right w:val="single" w:color="9CA3AF" w:sz="4"/>
+            </w:tcBorders>
+            <w:tcMar>
+              <w:top w:type="dxa" w:w="60"/>
+              <w:left w:type="dxa" w:w="100"/>
+              <w:bottom w:type="dxa" w:w="60"/>
+              <w:right w:type="dxa" w:w="100"/>
+            </w:tcMar>
+          </w:tcPr>
+          <w:p>
+            <w:pPr>
+              <w:spacing w:after="0" w:line="270"/>
+              <w:jc w:val="left"/>
+            </w:pPr>
+            <w:r>
+              <w:rPr>
+                <w:rFonts w:ascii="Malgun Gothic" w:cs="Malgun Gothic" w:eastAsia="Malgun Gothic" w:hAnsi="Malgun Gothic"/>
+                <w:b w:val="false"/>
+                <w:bCs w:val="false"/>
+                <w:color w:val="222222"/>
+                <w:sz w:val="17"/>
+                <w:szCs w:val="17"/>
+              </w:rPr>
+              <w:t xml:space="preserve">H-10</w:t>
+            </w:r>
+          </w:p>
+        </w:tc>
+        <w:tc>
+          <w:tcPr>
+            <w:tcW w:type="dxa" w:w="800"/>
+            <w:tcBorders>
+              <w:top w:val="single" w:color="9CA3AF" w:sz="4"/>
+              <w:left w:val="single" w:color="9CA3AF" w:sz="4"/>
+              <w:bottom w:val="single" w:color="9CA3AF" w:sz="4"/>
+              <w:right w:val="single" w:color="9CA3AF" w:sz="4"/>
+            </w:tcBorders>
+            <w:tcMar>
+              <w:top w:type="dxa" w:w="60"/>
+              <w:left w:type="dxa" w:w="100"/>
+              <w:bottom w:type="dxa" w:w="60"/>
+              <w:right w:type="dxa" w:w="100"/>
+            </w:tcMar>
+          </w:tcPr>
+          <w:p>
+            <w:pPr>
+              <w:spacing w:after="0" w:line="270"/>
+              <w:jc w:val="left"/>
+            </w:pPr>
+            <w:r>
+              <w:rPr>
+                <w:rFonts w:ascii="Malgun Gothic" w:cs="Malgun Gothic" w:eastAsia="Malgun Gothic" w:hAnsi="Malgun Gothic"/>
+                <w:b w:val="false"/>
+                <w:bCs w:val="false"/>
+                <w:color w:val="222222"/>
+                <w:sz w:val="17"/>
+                <w:szCs w:val="17"/>
+              </w:rPr>
+              <w:t xml:space="preserve"/>
+            </w:r>
+          </w:p>
+        </w:tc>
+      </w:tr>
+      <w:tr>
+        <w:trPr>
+          <w:cantSplit/>
+          <w:tblHeader w:val="false"/>
+        </w:trPr>
+        <w:tc>
+          <w:tcPr>
+            <w:tcW w:type="dxa" w:w="700"/>
+            <w:tcBorders>
+              <w:top w:val="single" w:color="9CA3AF" w:sz="4"/>
+              <w:left w:val="single" w:color="9CA3AF" w:sz="4"/>
+              <w:bottom w:val="single" w:color="9CA3AF" w:sz="4"/>
+              <w:right w:val="single" w:color="9CA3AF" w:sz="4"/>
+            </w:tcBorders>
+            <w:tcMar>
+              <w:top w:type="dxa" w:w="60"/>
+              <w:left w:type="dxa" w:w="100"/>
+              <w:bottom w:type="dxa" w:w="60"/>
+              <w:right w:type="dxa" w:w="100"/>
+            </w:tcMar>
+          </w:tcPr>
+          <w:p>
+            <w:pPr>
+              <w:spacing w:after="0" w:line="270"/>
+              <w:jc w:val="left"/>
+            </w:pPr>
+            <w:r>
+              <w:rPr>
+                <w:rFonts w:ascii="Malgun Gothic" w:cs="Malgun Gothic" w:eastAsia="Malgun Gothic" w:hAnsi="Malgun Gothic"/>
+                <w:b/>
+                <w:bCs/>
+                <w:color w:val="222222"/>
+                <w:sz w:val="17"/>
+                <w:szCs w:val="17"/>
+              </w:rPr>
+              <w:t xml:space="preserve">H-11</w:t>
+            </w:r>
+          </w:p>
+        </w:tc>
+        <w:tc>
+          <w:tcPr>
+            <w:tcW w:type="dxa" w:w="900"/>
+            <w:tcBorders>
+              <w:top w:val="single" w:color="9CA3AF" w:sz="4"/>
+              <w:left w:val="single" w:color="9CA3AF" w:sz="4"/>
+              <w:bottom w:val="single" w:color="9CA3AF" w:sz="4"/>
+              <w:right w:val="single" w:color="9CA3AF" w:sz="4"/>
+            </w:tcBorders>
+            <w:tcMar>
+              <w:top w:type="dxa" w:w="60"/>
+              <w:left w:type="dxa" w:w="100"/>
+              <w:bottom w:type="dxa" w:w="60"/>
+              <w:right w:type="dxa" w:w="100"/>
+            </w:tcMar>
+          </w:tcPr>
+          <w:p>
+            <w:pPr>
+              <w:spacing w:after="0" w:line="270"/>
+              <w:jc w:val="left"/>
+            </w:pPr>
+            <w:r>
+              <w:rPr>
+                <w:rFonts w:ascii="Malgun Gothic" w:cs="Malgun Gothic" w:eastAsia="Malgun Gothic" w:hAnsi="Malgun Gothic"/>
+                <w:b w:val="false"/>
+                <w:bCs w:val="false"/>
+                <w:color w:val="222222"/>
+                <w:sz w:val="17"/>
+                <w:szCs w:val="17"/>
+              </w:rPr>
+              <w:t xml:space="preserve">★☆☆</w:t>
+            </w:r>
+          </w:p>
+        </w:tc>
+        <w:tc>
+          <w:tcPr>
+            <w:tcW w:type="dxa" w:w="6238"/>
+            <w:tcBorders>
+              <w:top w:val="single" w:color="9CA3AF" w:sz="4"/>
+              <w:left w:val="single" w:color="9CA3AF" w:sz="4"/>
+              <w:bottom w:val="single" w:color="9CA3AF" w:sz="4"/>
+              <w:right w:val="single" w:color="9CA3AF" w:sz="4"/>
+            </w:tcBorders>
+            <w:tcMar>
+              <w:top w:type="dxa" w:w="60"/>
+              <w:left w:type="dxa" w:w="100"/>
+              <w:bottom w:type="dxa" w:w="60"/>
+              <w:right w:type="dxa" w:w="100"/>
+            </w:tcMar>
+          </w:tcPr>
+          <w:p>
+            <w:pPr>
+              <w:spacing w:after="0" w:line="270"/>
+              <w:jc w:val="left"/>
+            </w:pPr>
+            <w:r>
+              <w:rPr>
+                <w:rFonts w:ascii="Malgun Gothic" w:cs="Malgun Gothic" w:eastAsia="Malgun Gothic" w:hAnsi="Malgun Gothic"/>
+                <w:b w:val="false"/>
+                <w:bCs w:val="false"/>
+                <w:color w:val="222222"/>
+                <w:sz w:val="17"/>
+                <w:szCs w:val="17"/>
+              </w:rPr>
+              <w:t xml:space="preserve">축발전기만으로 EEDI가 4.411에서 3.580으로 내려가는 이유는?</w:t>
+            </w:r>
+          </w:p>
+        </w:tc>
+        <w:tc>
+          <w:tcPr>
+            <w:tcW w:type="dxa" w:w="1000"/>
+            <w:tcBorders>
+              <w:top w:val="single" w:color="9CA3AF" w:sz="4"/>
+              <w:left w:val="single" w:color="9CA3AF" w:sz="4"/>
+              <w:bottom w:val="single" w:color="9CA3AF" w:sz="4"/>
+              <w:right w:val="single" w:color="9CA3AF" w:sz="4"/>
+            </w:tcBorders>
+            <w:tcMar>
+              <w:top w:type="dxa" w:w="60"/>
+              <w:left w:type="dxa" w:w="100"/>
+              <w:bottom w:type="dxa" w:w="60"/>
+              <w:right w:type="dxa" w:w="100"/>
+            </w:tcMar>
+          </w:tcPr>
+          <w:p>
+            <w:pPr>
+              <w:spacing w:after="0" w:line="270"/>
+              <w:jc w:val="left"/>
+            </w:pPr>
+            <w:r>
+              <w:rPr>
+                <w:rFonts w:ascii="Malgun Gothic" w:cs="Malgun Gothic" w:eastAsia="Malgun Gothic" w:hAnsi="Malgun Gothic"/>
+                <w:b w:val="false"/>
+                <w:bCs w:val="false"/>
+                <w:color w:val="222222"/>
+                <w:sz w:val="17"/>
+                <w:szCs w:val="17"/>
+              </w:rPr>
+              <w:t xml:space="preserve">H-11</w:t>
+            </w:r>
+          </w:p>
+        </w:tc>
+        <w:tc>
+          <w:tcPr>
+            <w:tcW w:type="dxa" w:w="800"/>
+            <w:tcBorders>
+              <w:top w:val="single" w:color="9CA3AF" w:sz="4"/>
+              <w:left w:val="single" w:color="9CA3AF" w:sz="4"/>
+              <w:bottom w:val="single" w:color="9CA3AF" w:sz="4"/>
+              <w:right w:val="single" w:color="9CA3AF" w:sz="4"/>
+            </w:tcBorders>
+            <w:tcMar>
+              <w:top w:type="dxa" w:w="60"/>
+              <w:left w:type="dxa" w:w="100"/>
+              <w:bottom w:type="dxa" w:w="60"/>
+              <w:right w:type="dxa" w:w="100"/>
+            </w:tcMar>
+          </w:tcPr>
+          <w:p>
+            <w:pPr>
+              <w:spacing w:after="0" w:line="270"/>
+              <w:jc w:val="left"/>
+            </w:pPr>
+            <w:r>
+              <w:rPr>
+                <w:rFonts w:ascii="Malgun Gothic" w:cs="Malgun Gothic" w:eastAsia="Malgun Gothic" w:hAnsi="Malgun Gothic"/>
+                <w:b w:val="false"/>
+                <w:bCs w:val="false"/>
+                <w:color w:val="222222"/>
+                <w:sz w:val="17"/>
+                <w:szCs w:val="17"/>
+              </w:rPr>
+              <w:t xml:space="preserve"/>
+            </w:r>
+          </w:p>
+        </w:tc>
+      </w:tr>
+      <w:tr>
+        <w:trPr>
+          <w:cantSplit/>
+          <w:tblHeader w:val="false"/>
+        </w:trPr>
+        <w:tc>
+          <w:tcPr>
+            <w:tcW w:type="dxa" w:w="700"/>
+            <w:tcBorders>
+              <w:top w:val="single" w:color="9CA3AF" w:sz="4"/>
+              <w:left w:val="single" w:color="9CA3AF" w:sz="4"/>
+              <w:bottom w:val="single" w:color="9CA3AF" w:sz="4"/>
+              <w:right w:val="single" w:color="9CA3AF" w:sz="4"/>
+            </w:tcBorders>
+            <w:tcMar>
+              <w:top w:type="dxa" w:w="60"/>
+              <w:left w:type="dxa" w:w="100"/>
+              <w:bottom w:type="dxa" w:w="60"/>
+              <w:right w:type="dxa" w:w="100"/>
+            </w:tcMar>
+          </w:tcPr>
+          <w:p>
+            <w:pPr>
+              <w:spacing w:after="0" w:line="270"/>
+              <w:jc w:val="left"/>
+            </w:pPr>
+            <w:r>
+              <w:rPr>
+                <w:rFonts w:ascii="Malgun Gothic" w:cs="Malgun Gothic" w:eastAsia="Malgun Gothic" w:hAnsi="Malgun Gothic"/>
+                <w:b/>
+                <w:bCs/>
+                <w:color w:val="222222"/>
+                <w:sz w:val="17"/>
+                <w:szCs w:val="17"/>
+              </w:rPr>
+              <w:t xml:space="preserve">H-12</w:t>
+            </w:r>
+          </w:p>
+        </w:tc>
+        <w:tc>
+          <w:tcPr>
+            <w:tcW w:type="dxa" w:w="900"/>
+            <w:tcBorders>
+              <w:top w:val="single" w:color="9CA3AF" w:sz="4"/>
+              <w:left w:val="single" w:color="9CA3AF" w:sz="4"/>
+              <w:bottom w:val="single" w:color="9CA3AF" w:sz="4"/>
+              <w:right w:val="single" w:color="9CA3AF" w:sz="4"/>
+            </w:tcBorders>
+            <w:tcMar>
+              <w:top w:type="dxa" w:w="60"/>
+              <w:left w:type="dxa" w:w="100"/>
+              <w:bottom w:type="dxa" w:w="60"/>
+              <w:right w:type="dxa" w:w="100"/>
+            </w:tcMar>
+          </w:tcPr>
+          <w:p>
+            <w:pPr>
+              <w:spacing w:after="0" w:line="270"/>
+              <w:jc w:val="left"/>
+            </w:pPr>
+            <w:r>
+              <w:rPr>
+                <w:rFonts w:ascii="Malgun Gothic" w:cs="Malgun Gothic" w:eastAsia="Malgun Gothic" w:hAnsi="Malgun Gothic"/>
+                <w:b w:val="false"/>
+                <w:bCs w:val="false"/>
+                <w:color w:val="222222"/>
+                <w:sz w:val="17"/>
+                <w:szCs w:val="17"/>
+              </w:rPr>
+              <w:t xml:space="preserve">★☆☆</w:t>
+            </w:r>
+          </w:p>
+        </w:tc>
+        <w:tc>
+          <w:tcPr>
+            <w:tcW w:type="dxa" w:w="6238"/>
+            <w:tcBorders>
+              <w:top w:val="single" w:color="9CA3AF" w:sz="4"/>
+              <w:left w:val="single" w:color="9CA3AF" w:sz="4"/>
+              <w:bottom w:val="single" w:color="9CA3AF" w:sz="4"/>
+              <w:right w:val="single" w:color="9CA3AF" w:sz="4"/>
+            </w:tcBorders>
+            <w:tcMar>
+              <w:top w:type="dxa" w:w="60"/>
+              <w:left w:type="dxa" w:w="100"/>
+              <w:bottom w:type="dxa" w:w="60"/>
+              <w:right w:type="dxa" w:w="100"/>
+            </w:tcMar>
+          </w:tcPr>
+          <w:p>
+            <w:pPr>
+              <w:spacing w:after="0" w:line="270"/>
+              <w:jc w:val="left"/>
+            </w:pPr>
+            <w:r>
+              <w:rPr>
+                <w:rFonts w:ascii="Malgun Gothic" w:cs="Malgun Gothic" w:eastAsia="Malgun Gothic" w:hAnsi="Malgun Gothic"/>
+                <w:b w:val="false"/>
+                <w:bCs w:val="false"/>
+                <w:color w:val="222222"/>
+                <w:sz w:val="17"/>
+                <w:szCs w:val="17"/>
+              </w:rPr>
               <w:t xml:space="preserve">CII·EEXI 같은 운항 규제에는 어떻게 대응합니까?</w:t>
             </w:r>
           </w:p>
@@ -19411,7 +20467,7 @@
                 <w:sz w:val="17"/>
                 <w:szCs w:val="17"/>
               </w:rPr>
-              <w:t xml:space="preserve">H-6</w:t>
+              <w:t xml:space="preserve">H-12</w:t>
             </w:r>
           </w:p>
         </w:tc>
@@ -30170,11 +31226,11 @@
           <w:rFonts w:ascii="Malgun Gothic" w:cs="Malgun Gothic" w:eastAsia="Malgun Gothic" w:hAnsi="Malgun Gothic"/>
           <w:b/>
           <w:bCs/>
-          <w:color w:val="1F3864"/>
+          <w:color w:val="C00000"/>
           <w:sz w:val="23"/>
           <w:szCs w:val="23"/>
         </w:rPr>
-        <w:t xml:space="preserve">[H-5] ★☆☆   축발전기만으로 EEDI가 4.411에서 3.580으로 내려가는 이유는?</w:t>
+        <w:t xml:space="preserve">[H-5] ★★★   추력은 총저항의 12.2%인데 제동마력 절감은 8.8%입니다. 왜 다릅니까?</w:t>
       </w:r>
     </w:p>
     <w:p>
@@ -30202,7 +31258,7 @@
           <w:sz w:val="21"/>
           <w:szCs w:val="21"/>
         </w:rPr>
-        <w:t xml:space="preserve">산식 메커니즘.</w:t>
+        <w:t xml:space="preserve">슬라이드 15 표에 두 숫자가 나란히 있어 반드시 나온다.</w:t>
       </w:r>
     </w:p>
     <w:tbl>
@@ -30263,7 +31319,7 @@
                 <w:sz w:val="21"/>
                 <w:szCs w:val="21"/>
               </w:rPr>
-              <w:t xml:space="preserve">축발전기를 설치하면 EEDI 식에서 주기관 출력 P_ME를 MCR에서 축발전기 출력의 75%인 P_PTO만큼 뺀 값으로 계산하고, 보조기관 부하는 그만큼 P_AE,PTO로 옮겨집니다. 탄소계수와 연료소모율이 높은 보조기관 몫이 주기관 쪽으로 이전되면서 합산 EEDI가 내려갑니다.</w:t>
+              <w:t xml:space="preserve">서로 다른 양입니다. 12.2%는 왕복평균 추력 82.1 kN을 실선 총저항 673.69 kN으로 나눈 힘의 비이고, 8.8%는 그 추력이 줄여주는 주기관 제동마력 725 kW를 NCR 8,201.6 kW로 나눈 값입니다. 힘이 줄어도 프로펠러·축계 효율 사슬을 거치면서 마력 절감률은 힘의 비보다 작아집니다. 연료와 CO₂ 절감은 마력 기준인 8.8%에 대응하며, 보고서에도 두 값을 섞어 쓰면 안 된다고 명시했습니다.</w:t>
             </w:r>
           </w:p>
         </w:tc>
@@ -30294,11 +31350,819 @@
           <w:rFonts w:ascii="Malgun Gothic" w:cs="Malgun Gothic" w:eastAsia="Malgun Gothic" w:hAnsi="Malgun Gothic"/>
           <w:b/>
           <w:bCs/>
+          <w:color w:val="C00000"/>
+          <w:sz w:val="23"/>
+          <w:szCs w:val="23"/>
+        </w:rPr>
+        <w:t xml:space="preserve">[H-6] ★★★   로터세일 구동 전력(115 kW × 3기)은 절감량에서 뺐습니까?</w:t>
+      </w:r>
+    </w:p>
+    <w:p>
+      <w:pPr>
+        <w:keepNext/>
+        <w:spacing w:after="80" w:line="300"/>
+      </w:pPr>
+      <w:r>
+        <w:rPr>
+          <w:rFonts w:ascii="Malgun Gothic" w:cs="Malgun Gothic" w:eastAsia="Malgun Gothic" w:hAnsi="Malgun Gothic"/>
+          <w:b/>
+          <w:bCs/>
+          <w:color w:val="595959"/>
+          <w:sz w:val="21"/>
+          <w:szCs w:val="21"/>
+        </w:rPr>
+        <w:t xml:space="preserve">의도  </w:t>
+      </w:r>
+      <w:r>
+        <w:rPr>
+          <w:rFonts w:ascii="Malgun Gothic" w:cs="Malgun Gothic" w:eastAsia="Malgun Gothic" w:hAnsi="Malgun Gothic"/>
+          <w:i/>
+          <w:iCs/>
+          <w:color w:val="595959"/>
+          <w:sz w:val="21"/>
+          <w:szCs w:val="21"/>
+        </w:rPr>
+        <w:t xml:space="preserve">로터는 모터로 돌리므로 전력을 소비한다. 순절감을 묻는 정석 질문. 보고서에는 차감 계산이 없다.</w:t>
+      </w:r>
+    </w:p>
+    <w:tbl>
+      <w:tblPr>
+        <w:tblW w:type="dxa" w:w="9638"/>
+        <w:tblBorders>
+          <w:top w:val="single" w:color="auto" w:sz="4"/>
+          <w:left w:val="single" w:color="auto" w:sz="4"/>
+          <w:bottom w:val="single" w:color="auto" w:sz="4"/>
+          <w:right w:val="single" w:color="auto" w:sz="4"/>
+          <w:insideH w:val="single" w:color="auto" w:sz="4"/>
+          <w:insideV w:val="single" w:color="auto" w:sz="4"/>
+        </w:tblBorders>
+      </w:tblPr>
+      <w:tblGrid>
+        <w:gridCol w:w="9638"/>
+      </w:tblGrid>
+      <w:tr>
+        <w:trPr>
+          <w:cantSplit/>
+        </w:trPr>
+        <w:tc>
+          <w:tcPr>
+            <w:tcW w:type="dxa" w:w="9638"/>
+            <w:tcBorders>
+              <w:top w:val="single" w:color="BFC5D2" w:sz="4"/>
+              <w:left w:val="single" w:color="BFC5D2" w:sz="4"/>
+              <w:bottom w:val="single" w:color="BFC5D2" w:sz="4"/>
+              <w:right w:val="single" w:color="BFC5D2" w:sz="4"/>
+            </w:tcBorders>
+            <w:shd w:fill="F2F5FA" w:color="auto" w:val="clear"/>
+            <w:tcMar>
+              <w:top w:type="dxa" w:w="120"/>
+              <w:left w:type="dxa" w:w="180"/>
+              <w:bottom w:type="dxa" w:w="120"/>
+              <w:right w:type="dxa" w:w="180"/>
+            </w:tcMar>
+          </w:tcPr>
+          <w:p>
+            <w:pPr>
+              <w:spacing w:after="0" w:line="310"/>
+            </w:pPr>
+            <w:r>
+              <w:rPr>
+                <w:rFonts w:ascii="Malgun Gothic" w:cs="Malgun Gothic" w:eastAsia="Malgun Gothic" w:hAnsi="Malgun Gothic"/>
+                <w:b/>
+                <w:bCs/>
+                <w:color w:val="1F3864"/>
+                <w:sz w:val="21"/>
+                <w:szCs w:val="21"/>
+              </w:rPr>
+              <w:t xml:space="preserve">답변  </w:t>
+            </w:r>
+            <w:r>
+              <w:rPr>
+                <w:rFonts w:ascii="Malgun Gothic" w:cs="Malgun Gothic" w:eastAsia="Malgun Gothic" w:hAnsi="Malgun Gothic"/>
+                <w:color w:val="222222"/>
+                <w:sz w:val="21"/>
+                <w:szCs w:val="21"/>
+              </w:rPr>
+              <w:t xml:space="preserve">차감하지 않았습니다. 카탈로그 115 kW는 스핀업과 최대 회전수 기준의 모터 정격이고, 정상 운전에서는 스핀비 제어로 평균 소비가 그보다 낮아 제조사는 절감 대비 약 10분의 1 수준으로 제시합니다. 다만 가장 보수적으로 3기 정격 345 kW를 전부 빼더라도 순절감은 약 380 kW, NCR의 4.6%가 남아 투자 타당성은 유지됩니다. 보고서에 이 순절감 계산을 넣지 못한 점은 보완하겠습니다.</w:t>
+            </w:r>
+          </w:p>
+        </w:tc>
+      </w:tr>
+    </w:tbl>
+    <w:tbl>
+      <w:tblPr>
+        <w:tblW w:type="dxa" w:w="9638"/>
+        <w:tblBorders>
+          <w:top w:val="single" w:color="auto" w:sz="4"/>
+          <w:left w:val="single" w:color="auto" w:sz="4"/>
+          <w:bottom w:val="single" w:color="auto" w:sz="4"/>
+          <w:right w:val="single" w:color="auto" w:sz="4"/>
+          <w:insideH w:val="single" w:color="auto" w:sz="4"/>
+          <w:insideV w:val="single" w:color="auto" w:sz="4"/>
+        </w:tblBorders>
+      </w:tblPr>
+      <w:tblGrid>
+        <w:gridCol w:w="9638"/>
+      </w:tblGrid>
+      <w:tr>
+        <w:trPr>
+          <w:cantSplit/>
+        </w:trPr>
+        <w:tc>
+          <w:tcPr>
+            <w:tcW w:type="dxa" w:w="9638"/>
+            <w:tcBorders>
+              <w:top w:val="single" w:color="F0C36D" w:sz="4"/>
+              <w:left w:val="single" w:color="F0C36D" w:sz="4"/>
+              <w:bottom w:val="single" w:color="F0C36D" w:sz="4"/>
+              <w:right w:val="single" w:color="F0C36D" w:sz="4"/>
+            </w:tcBorders>
+            <w:shd w:fill="FFF4E5" w:color="auto" w:val="clear"/>
+            <w:tcMar>
+              <w:top w:type="dxa" w:w="120"/>
+              <w:left w:type="dxa" w:w="180"/>
+              <w:bottom w:type="dxa" w:w="120"/>
+              <w:right w:type="dxa" w:w="180"/>
+            </w:tcMar>
+          </w:tcPr>
+          <w:p>
+            <w:pPr>
+              <w:spacing w:after="0"/>
+            </w:pPr>
+            <w:r>
+              <w:rPr>
+                <w:rFonts w:ascii="Malgun Gothic" w:cs="Malgun Gothic" w:eastAsia="Malgun Gothic" w:hAnsi="Malgun Gothic"/>
+                <w:b/>
+                <w:bCs/>
+                <w:color w:val="C00000"/>
+                <w:sz w:val="21"/>
+                <w:szCs w:val="21"/>
+              </w:rPr>
+              <w:t xml:space="preserve">⚠ 주의  </w:t>
+            </w:r>
+            <w:r>
+              <w:rPr>
+                <w:rFonts w:ascii="Malgun Gothic" w:cs="Malgun Gothic" w:eastAsia="Malgun Gothic" w:hAnsi="Malgun Gothic"/>
+                <w:color w:val="222222"/>
+                <w:sz w:val="21"/>
+                <w:szCs w:val="21"/>
+              </w:rPr>
+              <w:t xml:space="preserve">725 − 345 = 380 kW. '빼지 않았다'를 먼저 말하고 보수적 순절감을 붙인다.</w:t>
+            </w:r>
+          </w:p>
+        </w:tc>
+      </w:tr>
+    </w:tbl>
+    <w:p>
+      <w:pPr>
+        <w:spacing w:after="100"/>
+      </w:pPr>
+      <w:r>
+        <w:rPr>
+          <w:rFonts w:ascii="Malgun Gothic" w:cs="Malgun Gothic" w:eastAsia="Malgun Gothic" w:hAnsi="Malgun Gothic"/>
+          <w:color w:val="222222"/>
+          <w:sz w:val="21"/>
+          <w:szCs w:val="21"/>
+        </w:rPr>
+        <w:t xml:space="preserve"/>
+      </w:r>
+    </w:p>
+    <w:p>
+      <w:pPr>
+        <w:pStyle w:val="Heading3"/>
+        <w:keepNext/>
+        <w:spacing w:after="80" w:before="200"/>
+      </w:pPr>
+      <w:r>
+        <w:rPr>
+          <w:rFonts w:ascii="Malgun Gothic" w:cs="Malgun Gothic" w:eastAsia="Malgun Gothic" w:hAnsi="Malgun Gothic"/>
+          <w:b/>
+          <w:bCs/>
           <w:color w:val="1F3864"/>
           <w:sz w:val="23"/>
           <w:szCs w:val="23"/>
         </w:rPr>
-        <w:t xml:space="preserve">[H-6] ★☆☆   CII·EEXI 같은 운항 규제에는 어떻게 대응합니까?</w:t>
+        <w:t xml:space="preserve">[H-7] ★★☆   Norsepower 카탈로그 최대추력은 205 kN인데 계산된 추력은 기당 27 kN입니다. 너무 작지 않습니까?</w:t>
+      </w:r>
+    </w:p>
+    <w:p>
+      <w:pPr>
+        <w:keepNext/>
+        <w:spacing w:after="80" w:line="300"/>
+      </w:pPr>
+      <w:r>
+        <w:rPr>
+          <w:rFonts w:ascii="Malgun Gothic" w:cs="Malgun Gothic" w:eastAsia="Malgun Gothic" w:hAnsi="Malgun Gothic"/>
+          <w:b/>
+          <w:bCs/>
+          <w:color w:val="595959"/>
+          <w:sz w:val="21"/>
+          <w:szCs w:val="21"/>
+        </w:rPr>
+        <w:t xml:space="preserve">의도  </w:t>
+      </w:r>
+      <w:r>
+        <w:rPr>
+          <w:rFonts w:ascii="Malgun Gothic" w:cs="Malgun Gothic" w:eastAsia="Malgun Gothic" w:hAnsi="Malgun Gothic"/>
+          <w:i/>
+          <w:iCs/>
+          <w:color w:val="595959"/>
+          <w:sz w:val="21"/>
+          <w:szCs w:val="21"/>
+        </w:rPr>
+        <w:t xml:space="preserve">표 8.7의 205 kN과 표 8.4의 82.1 kN(3기)을 비교하면 나온다.</w:t>
+      </w:r>
+    </w:p>
+    <w:tbl>
+      <w:tblPr>
+        <w:tblW w:type="dxa" w:w="9638"/>
+        <w:tblBorders>
+          <w:top w:val="single" w:color="auto" w:sz="4"/>
+          <w:left w:val="single" w:color="auto" w:sz="4"/>
+          <w:bottom w:val="single" w:color="auto" w:sz="4"/>
+          <w:right w:val="single" w:color="auto" w:sz="4"/>
+          <w:insideH w:val="single" w:color="auto" w:sz="4"/>
+          <w:insideV w:val="single" w:color="auto" w:sz="4"/>
+        </w:tblBorders>
+      </w:tblPr>
+      <w:tblGrid>
+        <w:gridCol w:w="9638"/>
+      </w:tblGrid>
+      <w:tr>
+        <w:trPr>
+          <w:cantSplit/>
+        </w:trPr>
+        <w:tc>
+          <w:tcPr>
+            <w:tcW w:type="dxa" w:w="9638"/>
+            <w:tcBorders>
+              <w:top w:val="single" w:color="BFC5D2" w:sz="4"/>
+              <w:left w:val="single" w:color="BFC5D2" w:sz="4"/>
+              <w:bottom w:val="single" w:color="BFC5D2" w:sz="4"/>
+              <w:right w:val="single" w:color="BFC5D2" w:sz="4"/>
+            </w:tcBorders>
+            <w:shd w:fill="F2F5FA" w:color="auto" w:val="clear"/>
+            <w:tcMar>
+              <w:top w:type="dxa" w:w="120"/>
+              <w:left w:type="dxa" w:w="180"/>
+              <w:bottom w:type="dxa" w:w="120"/>
+              <w:right w:type="dxa" w:w="180"/>
+            </w:tcMar>
+          </w:tcPr>
+          <w:p>
+            <w:pPr>
+              <w:spacing w:after="0" w:line="310"/>
+            </w:pPr>
+            <w:r>
+              <w:rPr>
+                <w:rFonts w:ascii="Malgun Gothic" w:cs="Malgun Gothic" w:eastAsia="Malgun Gothic" w:hAnsi="Malgun Gothic"/>
+                <w:b/>
+                <w:bCs/>
+                <w:color w:val="1F3864"/>
+                <w:sz w:val="21"/>
+                <w:szCs w:val="21"/>
+              </w:rPr>
+              <w:t xml:space="preserve">답변  </w:t>
+            </w:r>
+            <w:r>
+              <w:rPr>
+                <w:rFonts w:ascii="Malgun Gothic" w:cs="Malgun Gothic" w:eastAsia="Malgun Gothic" w:hAnsi="Malgun Gothic"/>
+                <w:color w:val="222222"/>
+                <w:sz w:val="21"/>
+                <w:szCs w:val="21"/>
+              </w:rPr>
+              <w:t xml:space="preserve">카탈로그 205 kN은 최대 연속 추력으로, 보고서 그림 8.5에서 역산하면 상대풍속 17~23 m/s, 합력계수 8~12일 때 값입니다. 본 항로의 연평균 풍속은 U10 7.0 m/s이고 겉보기 풍속이 4.7~14.4 m/s라 추력은 풍속 제곱에 비례해 훨씬 작습니다. 저희는 카탈로그가 아니라 항로 실제 풍황으로 계산했기 때문에 82.1 kN이 나온 것이고, 이것이 보수적인 값입니다. 실선 실적 8~9%와 맞는 것도 그 때문입니다.</w:t>
+            </w:r>
+          </w:p>
+        </w:tc>
+      </w:tr>
+    </w:tbl>
+    <w:p>
+      <w:pPr>
+        <w:spacing w:after="100"/>
+      </w:pPr>
+      <w:r>
+        <w:rPr>
+          <w:rFonts w:ascii="Malgun Gothic" w:cs="Malgun Gothic" w:eastAsia="Malgun Gothic" w:hAnsi="Malgun Gothic"/>
+          <w:color w:val="222222"/>
+          <w:sz w:val="21"/>
+          <w:szCs w:val="21"/>
+        </w:rPr>
+        <w:t xml:space="preserve"/>
+      </w:r>
+    </w:p>
+    <w:p>
+      <w:pPr>
+        <w:pStyle w:val="Heading3"/>
+        <w:keepNext/>
+        <w:spacing w:after="80" w:before="200"/>
+      </w:pPr>
+      <w:r>
+        <w:rPr>
+          <w:rFonts w:ascii="Malgun Gothic" w:cs="Malgun Gothic" w:eastAsia="Malgun Gothic" w:hAnsi="Malgun Gothic"/>
+          <w:b/>
+          <w:bCs/>
+          <w:color w:val="1F3864"/>
+          <w:sz w:val="23"/>
+          <w:szCs w:val="23"/>
+        </w:rPr>
+        <w:t xml:space="preserve">[H-8] ★★☆   실선 대조표에서 Jones et al.은 2.03%밖에 안 되는데 8.8%가 타당합니까?</w:t>
+      </w:r>
+    </w:p>
+    <w:p>
+      <w:pPr>
+        <w:keepNext/>
+        <w:spacing w:after="80" w:line="300"/>
+      </w:pPr>
+      <w:r>
+        <w:rPr>
+          <w:rFonts w:ascii="Malgun Gothic" w:cs="Malgun Gothic" w:eastAsia="Malgun Gothic" w:hAnsi="Malgun Gothic"/>
+          <w:b/>
+          <w:bCs/>
+          <w:color w:val="595959"/>
+          <w:sz w:val="21"/>
+          <w:szCs w:val="21"/>
+        </w:rPr>
+        <w:t xml:space="preserve">의도  </w:t>
+      </w:r>
+      <w:r>
+        <w:rPr>
+          <w:rFonts w:ascii="Malgun Gothic" w:cs="Malgun Gothic" w:eastAsia="Malgun Gothic" w:hAnsi="Malgun Gothic"/>
+          <w:i/>
+          <w:iCs/>
+          <w:color w:val="595959"/>
+          <w:sz w:val="21"/>
+          <w:szCs w:val="21"/>
+        </w:rPr>
+        <w:t xml:space="preserve">표 8.6에서 가장 낮은 값을 골라 묻는다. 슬라이드에는 8.2%와 9.1%만 적혀 있어 '유리한 것만 골랐다'로 이어질 수 있다.</w:t>
+      </w:r>
+    </w:p>
+    <w:tbl>
+      <w:tblPr>
+        <w:tblW w:type="dxa" w:w="9638"/>
+        <w:tblBorders>
+          <w:top w:val="single" w:color="auto" w:sz="4"/>
+          <w:left w:val="single" w:color="auto" w:sz="4"/>
+          <w:bottom w:val="single" w:color="auto" w:sz="4"/>
+          <w:right w:val="single" w:color="auto" w:sz="4"/>
+          <w:insideH w:val="single" w:color="auto" w:sz="4"/>
+          <w:insideV w:val="single" w:color="auto" w:sz="4"/>
+        </w:tblBorders>
+      </w:tblPr>
+      <w:tblGrid>
+        <w:gridCol w:w="9638"/>
+      </w:tblGrid>
+      <w:tr>
+        <w:trPr>
+          <w:cantSplit/>
+        </w:trPr>
+        <w:tc>
+          <w:tcPr>
+            <w:tcW w:type="dxa" w:w="9638"/>
+            <w:tcBorders>
+              <w:top w:val="single" w:color="BFC5D2" w:sz="4"/>
+              <w:left w:val="single" w:color="BFC5D2" w:sz="4"/>
+              <w:bottom w:val="single" w:color="BFC5D2" w:sz="4"/>
+              <w:right w:val="single" w:color="BFC5D2" w:sz="4"/>
+            </w:tcBorders>
+            <w:shd w:fill="F2F5FA" w:color="auto" w:val="clear"/>
+            <w:tcMar>
+              <w:top w:type="dxa" w:w="120"/>
+              <w:left w:type="dxa" w:w="180"/>
+              <w:bottom w:type="dxa" w:w="120"/>
+              <w:right w:type="dxa" w:w="180"/>
+            </w:tcMar>
+          </w:tcPr>
+          <w:p>
+            <w:pPr>
+              <w:spacing w:after="0" w:line="310"/>
+            </w:pPr>
+            <w:r>
+              <w:rPr>
+                <w:rFonts w:ascii="Malgun Gothic" w:cs="Malgun Gothic" w:eastAsia="Malgun Gothic" w:hAnsi="Malgun Gothic"/>
+                <w:b/>
+                <w:bCs/>
+                <w:color w:val="1F3864"/>
+                <w:sz w:val="21"/>
+                <w:szCs w:val="21"/>
+              </w:rPr>
+              <w:t xml:space="preserve">답변  </w:t>
+            </w:r>
+            <w:r>
+              <w:rPr>
+                <w:rFonts w:ascii="Malgun Gothic" w:cs="Malgun Gothic" w:eastAsia="Malgun Gothic" w:hAnsi="Malgun Gothic"/>
+                <w:color w:val="222222"/>
+                <w:sz w:val="21"/>
+                <w:szCs w:val="21"/>
+              </w:rPr>
+              <w:t xml:space="preserve">Jones et al.은 14노트 조건에서 CFD와 VPP로 계산한 소요출력 절감률이고, 풍황이 약하고 풍향이 바뀌는 항로 조건이라 낮게 나왔습니다. 로터세일 효과는 항로 풍황에 거의 전적으로 좌우됩니다. 본 항로는 연중 북동무역풍이 정횡에서 들어오는 조건이라 Maersk Pelican 8.2%, TR Lady 9.1%, Lu &amp; Ringsberg의 Aframax 6.5~8.9%와 같은 상단 값이 타당하며, 저희 8.8%도 그 범위 안에 있습니다. 풍황이 다른 항로에 투입되면 2~5%까지 떨어질 수 있다는 점은 인정합니다.</w:t>
+            </w:r>
+          </w:p>
+        </w:tc>
+      </w:tr>
+    </w:tbl>
+    <w:p>
+      <w:pPr>
+        <w:spacing w:after="100"/>
+      </w:pPr>
+      <w:r>
+        <w:rPr>
+          <w:rFonts w:ascii="Malgun Gothic" w:cs="Malgun Gothic" w:eastAsia="Malgun Gothic" w:hAnsi="Malgun Gothic"/>
+          <w:color w:val="222222"/>
+          <w:sz w:val="21"/>
+          <w:szCs w:val="21"/>
+        </w:rPr>
+        <w:t xml:space="preserve"/>
+      </w:r>
+    </w:p>
+    <w:p>
+      <w:pPr>
+        <w:pStyle w:val="Heading3"/>
+        <w:keepNext/>
+        <w:spacing w:after="80" w:before="200"/>
+      </w:pPr>
+      <w:r>
+        <w:rPr>
+          <w:rFonts w:ascii="Malgun Gothic" w:cs="Malgun Gothic" w:eastAsia="Malgun Gothic" w:hAnsi="Malgun Gothic"/>
+          <w:b/>
+          <w:bCs/>
+          <w:color w:val="1F3864"/>
+          <w:sz w:val="23"/>
+          <w:szCs w:val="23"/>
+        </w:rPr>
+        <w:t xml:space="preserve">[H-9] ★☆☆   8.6절의 연간 연료비 1,040만 달러는 어디서 나온 값입니까? 8.7절 항해비와 다른데요.</w:t>
+      </w:r>
+    </w:p>
+    <w:p>
+      <w:pPr>
+        <w:keepNext/>
+        <w:spacing w:after="80" w:line="300"/>
+      </w:pPr>
+      <w:r>
+        <w:rPr>
+          <w:rFonts w:ascii="Malgun Gothic" w:cs="Malgun Gothic" w:eastAsia="Malgun Gothic" w:hAnsi="Malgun Gothic"/>
+          <w:b/>
+          <w:bCs/>
+          <w:color w:val="595959"/>
+          <w:sz w:val="21"/>
+          <w:szCs w:val="21"/>
+        </w:rPr>
+        <w:t xml:space="preserve">의도  </w:t>
+      </w:r>
+      <w:r>
+        <w:rPr>
+          <w:rFonts w:ascii="Malgun Gothic" w:cs="Malgun Gothic" w:eastAsia="Malgun Gothic" w:hAnsi="Malgun Gothic"/>
+          <w:i/>
+          <w:iCs/>
+          <w:color w:val="595959"/>
+          <w:sz w:val="21"/>
+          <w:szCs w:val="21"/>
+        </w:rPr>
+        <w:t xml:space="preserve">미주 xviii가 본문에 없어 출처 확인이 안 된다. 8.7절 연료비는 61항차 × 19.3만 = 약 1,180만 달러다.</w:t>
+      </w:r>
+    </w:p>
+    <w:tbl>
+      <w:tblPr>
+        <w:tblW w:type="dxa" w:w="9638"/>
+        <w:tblBorders>
+          <w:top w:val="single" w:color="auto" w:sz="4"/>
+          <w:left w:val="single" w:color="auto" w:sz="4"/>
+          <w:bottom w:val="single" w:color="auto" w:sz="4"/>
+          <w:right w:val="single" w:color="auto" w:sz="4"/>
+          <w:insideH w:val="single" w:color="auto" w:sz="4"/>
+          <w:insideV w:val="single" w:color="auto" w:sz="4"/>
+        </w:tblBorders>
+      </w:tblPr>
+      <w:tblGrid>
+        <w:gridCol w:w="9638"/>
+      </w:tblGrid>
+      <w:tr>
+        <w:trPr>
+          <w:cantSplit/>
+        </w:trPr>
+        <w:tc>
+          <w:tcPr>
+            <w:tcW w:type="dxa" w:w="9638"/>
+            <w:tcBorders>
+              <w:top w:val="single" w:color="BFC5D2" w:sz="4"/>
+              <w:left w:val="single" w:color="BFC5D2" w:sz="4"/>
+              <w:bottom w:val="single" w:color="BFC5D2" w:sz="4"/>
+              <w:right w:val="single" w:color="BFC5D2" w:sz="4"/>
+            </w:tcBorders>
+            <w:shd w:fill="F2F5FA" w:color="auto" w:val="clear"/>
+            <w:tcMar>
+              <w:top w:type="dxa" w:w="120"/>
+              <w:left w:type="dxa" w:w="180"/>
+              <w:bottom w:type="dxa" w:w="120"/>
+              <w:right w:type="dxa" w:w="180"/>
+            </w:tcMar>
+          </w:tcPr>
+          <w:p>
+            <w:pPr>
+              <w:spacing w:after="0" w:line="310"/>
+            </w:pPr>
+            <w:r>
+              <w:rPr>
+                <w:rFonts w:ascii="Malgun Gothic" w:cs="Malgun Gothic" w:eastAsia="Malgun Gothic" w:hAnsi="Malgun Gothic"/>
+                <w:b/>
+                <w:bCs/>
+                <w:color w:val="1F3864"/>
+                <w:sz w:val="21"/>
+                <w:szCs w:val="21"/>
+              </w:rPr>
+              <w:t xml:space="preserve">답변  </w:t>
+            </w:r>
+            <w:r>
+              <w:rPr>
+                <w:rFonts w:ascii="Malgun Gothic" w:cs="Malgun Gothic" w:eastAsia="Malgun Gothic" w:hAnsi="Malgun Gothic"/>
+                <w:color w:val="222222"/>
+                <w:sz w:val="21"/>
+                <w:szCs w:val="21"/>
+              </w:rPr>
+              <w:t xml:space="preserve">3장 설계속도 선정에서 만든 속도별 경제성 분석표의 14.3노트 연간 연료비입니다. 8.7절과는 항차수·연료 단가 전제가 달라 약 1,180만 달러와 차이가 납니다. 로터세일 절감액은 이 값에 비례 배분한 것이라 절대값보다 8.8%라는 비율이 핵심이며, 전제를 통일하지 못한 것은 편집 결함으로 인정합니다.</w:t>
+            </w:r>
+          </w:p>
+        </w:tc>
+      </w:tr>
+    </w:tbl>
+    <w:p>
+      <w:pPr>
+        <w:spacing w:after="100"/>
+      </w:pPr>
+      <w:r>
+        <w:rPr>
+          <w:rFonts w:ascii="Malgun Gothic" w:cs="Malgun Gothic" w:eastAsia="Malgun Gothic" w:hAnsi="Malgun Gothic"/>
+          <w:color w:val="222222"/>
+          <w:sz w:val="21"/>
+          <w:szCs w:val="21"/>
+        </w:rPr>
+        <w:t xml:space="preserve"/>
+      </w:r>
+    </w:p>
+    <w:p>
+      <w:pPr>
+        <w:pStyle w:val="Heading3"/>
+        <w:keepNext/>
+        <w:spacing w:after="80" w:before="200"/>
+      </w:pPr>
+      <w:r>
+        <w:rPr>
+          <w:rFonts w:ascii="Malgun Gothic" w:cs="Malgun Gothic" w:eastAsia="Malgun Gothic" w:hAnsi="Malgun Gothic"/>
+          <w:b/>
+          <w:bCs/>
+          <w:color w:val="1F3864"/>
+          <w:sz w:val="23"/>
+          <w:szCs w:val="23"/>
+        </w:rPr>
+        <w:t xml:space="preserve">[H-10] ★☆☆   로터세일 유지비를 CAPEX의 5%/년으로 잡은 근거는?</w:t>
+      </w:r>
+    </w:p>
+    <w:p>
+      <w:pPr>
+        <w:keepNext/>
+        <w:spacing w:after="80" w:line="300"/>
+      </w:pPr>
+      <w:r>
+        <w:rPr>
+          <w:rFonts w:ascii="Malgun Gothic" w:cs="Malgun Gothic" w:eastAsia="Malgun Gothic" w:hAnsi="Malgun Gothic"/>
+          <w:b/>
+          <w:bCs/>
+          <w:color w:val="595959"/>
+          <w:sz w:val="21"/>
+          <w:szCs w:val="21"/>
+        </w:rPr>
+        <w:t xml:space="preserve">의도  </w:t>
+      </w:r>
+      <w:r>
+        <w:rPr>
+          <w:rFonts w:ascii="Malgun Gothic" w:cs="Malgun Gothic" w:eastAsia="Malgun Gothic" w:hAnsi="Malgun Gothic"/>
+          <w:i/>
+          <w:iCs/>
+          <w:color w:val="595959"/>
+          <w:sz w:val="21"/>
+          <w:szCs w:val="21"/>
+        </w:rPr>
+        <w:t xml:space="preserve">그림 8.7 캡션의 가정.</w:t>
+      </w:r>
+    </w:p>
+    <w:tbl>
+      <w:tblPr>
+        <w:tblW w:type="dxa" w:w="9638"/>
+        <w:tblBorders>
+          <w:top w:val="single" w:color="auto" w:sz="4"/>
+          <w:left w:val="single" w:color="auto" w:sz="4"/>
+          <w:bottom w:val="single" w:color="auto" w:sz="4"/>
+          <w:right w:val="single" w:color="auto" w:sz="4"/>
+          <w:insideH w:val="single" w:color="auto" w:sz="4"/>
+          <w:insideV w:val="single" w:color="auto" w:sz="4"/>
+        </w:tblBorders>
+      </w:tblPr>
+      <w:tblGrid>
+        <w:gridCol w:w="9638"/>
+      </w:tblGrid>
+      <w:tr>
+        <w:trPr>
+          <w:cantSplit/>
+        </w:trPr>
+        <w:tc>
+          <w:tcPr>
+            <w:tcW w:type="dxa" w:w="9638"/>
+            <w:tcBorders>
+              <w:top w:val="single" w:color="BFC5D2" w:sz="4"/>
+              <w:left w:val="single" w:color="BFC5D2" w:sz="4"/>
+              <w:bottom w:val="single" w:color="BFC5D2" w:sz="4"/>
+              <w:right w:val="single" w:color="BFC5D2" w:sz="4"/>
+            </w:tcBorders>
+            <w:shd w:fill="F2F5FA" w:color="auto" w:val="clear"/>
+            <w:tcMar>
+              <w:top w:type="dxa" w:w="120"/>
+              <w:left w:type="dxa" w:w="180"/>
+              <w:bottom w:type="dxa" w:w="120"/>
+              <w:right w:type="dxa" w:w="180"/>
+            </w:tcMar>
+          </w:tcPr>
+          <w:p>
+            <w:pPr>
+              <w:spacing w:after="0" w:line="310"/>
+            </w:pPr>
+            <w:r>
+              <w:rPr>
+                <w:rFonts w:ascii="Malgun Gothic" w:cs="Malgun Gothic" w:eastAsia="Malgun Gothic" w:hAnsi="Malgun Gothic"/>
+                <w:b/>
+                <w:bCs/>
+                <w:color w:val="1F3864"/>
+                <w:sz w:val="21"/>
+                <w:szCs w:val="21"/>
+              </w:rPr>
+              <w:t xml:space="preserve">답변  </w:t>
+            </w:r>
+            <w:r>
+              <w:rPr>
+                <w:rFonts w:ascii="Malgun Gothic" w:cs="Malgun Gothic" w:eastAsia="Malgun Gothic" w:hAnsi="Malgun Gothic"/>
+                <w:color w:val="222222"/>
+                <w:sz w:val="21"/>
+                <w:szCs w:val="21"/>
+              </w:rPr>
+              <w:t xml:space="preserve">풍력보조추진 장치의 문헌 통상값이 연 3~5%라 상단인 5%를 보수적으로 적용했습니다. 이 가정으로 투자비 1.2~2.85 M 달러 범위에서 회수기간 1.4~3.7년이 나오며, 유지비를 3%로 낮추면 회수기간은 약 0.2~0.4년 짧아집니다.</w:t>
+            </w:r>
+          </w:p>
+        </w:tc>
+      </w:tr>
+    </w:tbl>
+    <w:p>
+      <w:pPr>
+        <w:spacing w:after="100"/>
+      </w:pPr>
+      <w:r>
+        <w:rPr>
+          <w:rFonts w:ascii="Malgun Gothic" w:cs="Malgun Gothic" w:eastAsia="Malgun Gothic" w:hAnsi="Malgun Gothic"/>
+          <w:color w:val="222222"/>
+          <w:sz w:val="21"/>
+          <w:szCs w:val="21"/>
+        </w:rPr>
+        <w:t xml:space="preserve"/>
+      </w:r>
+    </w:p>
+    <w:p>
+      <w:pPr>
+        <w:pStyle w:val="Heading3"/>
+        <w:keepNext/>
+        <w:spacing w:after="80" w:before="200"/>
+      </w:pPr>
+      <w:r>
+        <w:rPr>
+          <w:rFonts w:ascii="Malgun Gothic" w:cs="Malgun Gothic" w:eastAsia="Malgun Gothic" w:hAnsi="Malgun Gothic"/>
+          <w:b/>
+          <w:bCs/>
+          <w:color w:val="1F3864"/>
+          <w:sz w:val="23"/>
+          <w:szCs w:val="23"/>
+        </w:rPr>
+        <w:t xml:space="preserve">[H-11] ★☆☆   축발전기만으로 EEDI가 4.411에서 3.580으로 내려가는 이유는?</w:t>
+      </w:r>
+    </w:p>
+    <w:p>
+      <w:pPr>
+        <w:keepNext/>
+        <w:spacing w:after="80" w:line="300"/>
+      </w:pPr>
+      <w:r>
+        <w:rPr>
+          <w:rFonts w:ascii="Malgun Gothic" w:cs="Malgun Gothic" w:eastAsia="Malgun Gothic" w:hAnsi="Malgun Gothic"/>
+          <w:b/>
+          <w:bCs/>
+          <w:color w:val="595959"/>
+          <w:sz w:val="21"/>
+          <w:szCs w:val="21"/>
+        </w:rPr>
+        <w:t xml:space="preserve">의도  </w:t>
+      </w:r>
+      <w:r>
+        <w:rPr>
+          <w:rFonts w:ascii="Malgun Gothic" w:cs="Malgun Gothic" w:eastAsia="Malgun Gothic" w:hAnsi="Malgun Gothic"/>
+          <w:i/>
+          <w:iCs/>
+          <w:color w:val="595959"/>
+          <w:sz w:val="21"/>
+          <w:szCs w:val="21"/>
+        </w:rPr>
+        <w:t xml:space="preserve">산식 메커니즘.</w:t>
+      </w:r>
+    </w:p>
+    <w:tbl>
+      <w:tblPr>
+        <w:tblW w:type="dxa" w:w="9638"/>
+        <w:tblBorders>
+          <w:top w:val="single" w:color="auto" w:sz="4"/>
+          <w:left w:val="single" w:color="auto" w:sz="4"/>
+          <w:bottom w:val="single" w:color="auto" w:sz="4"/>
+          <w:right w:val="single" w:color="auto" w:sz="4"/>
+          <w:insideH w:val="single" w:color="auto" w:sz="4"/>
+          <w:insideV w:val="single" w:color="auto" w:sz="4"/>
+        </w:tblBorders>
+      </w:tblPr>
+      <w:tblGrid>
+        <w:gridCol w:w="9638"/>
+      </w:tblGrid>
+      <w:tr>
+        <w:trPr>
+          <w:cantSplit/>
+        </w:trPr>
+        <w:tc>
+          <w:tcPr>
+            <w:tcW w:type="dxa" w:w="9638"/>
+            <w:tcBorders>
+              <w:top w:val="single" w:color="BFC5D2" w:sz="4"/>
+              <w:left w:val="single" w:color="BFC5D2" w:sz="4"/>
+              <w:bottom w:val="single" w:color="BFC5D2" w:sz="4"/>
+              <w:right w:val="single" w:color="BFC5D2" w:sz="4"/>
+            </w:tcBorders>
+            <w:shd w:fill="F2F5FA" w:color="auto" w:val="clear"/>
+            <w:tcMar>
+              <w:top w:type="dxa" w:w="120"/>
+              <w:left w:type="dxa" w:w="180"/>
+              <w:bottom w:type="dxa" w:w="120"/>
+              <w:right w:type="dxa" w:w="180"/>
+            </w:tcMar>
+          </w:tcPr>
+          <w:p>
+            <w:pPr>
+              <w:spacing w:after="0" w:line="310"/>
+            </w:pPr>
+            <w:r>
+              <w:rPr>
+                <w:rFonts w:ascii="Malgun Gothic" w:cs="Malgun Gothic" w:eastAsia="Malgun Gothic" w:hAnsi="Malgun Gothic"/>
+                <w:b/>
+                <w:bCs/>
+                <w:color w:val="1F3864"/>
+                <w:sz w:val="21"/>
+                <w:szCs w:val="21"/>
+              </w:rPr>
+              <w:t xml:space="preserve">답변  </w:t>
+            </w:r>
+            <w:r>
+              <w:rPr>
+                <w:rFonts w:ascii="Malgun Gothic" w:cs="Malgun Gothic" w:eastAsia="Malgun Gothic" w:hAnsi="Malgun Gothic"/>
+                <w:color w:val="222222"/>
+                <w:sz w:val="21"/>
+                <w:szCs w:val="21"/>
+              </w:rPr>
+              <w:t xml:space="preserve">축발전기를 설치하면 EEDI 식에서 주기관 출력 P_ME를 MCR에서 축발전기 출력의 75%인 P_PTO만큼 뺀 값으로 계산하고, 보조기관 부하는 그만큼 P_AE,PTO로 옮겨집니다. 탄소계수와 연료소모율이 높은 보조기관 몫이 주기관 쪽으로 이전되면서 합산 EEDI가 내려갑니다.</w:t>
+            </w:r>
+          </w:p>
+        </w:tc>
+      </w:tr>
+    </w:tbl>
+    <w:p>
+      <w:pPr>
+        <w:spacing w:after="100"/>
+      </w:pPr>
+      <w:r>
+        <w:rPr>
+          <w:rFonts w:ascii="Malgun Gothic" w:cs="Malgun Gothic" w:eastAsia="Malgun Gothic" w:hAnsi="Malgun Gothic"/>
+          <w:color w:val="222222"/>
+          <w:sz w:val="21"/>
+          <w:szCs w:val="21"/>
+        </w:rPr>
+        <w:t xml:space="preserve"/>
+      </w:r>
+    </w:p>
+    <w:p>
+      <w:pPr>
+        <w:pStyle w:val="Heading3"/>
+        <w:keepNext/>
+        <w:spacing w:after="80" w:before="200"/>
+      </w:pPr>
+      <w:r>
+        <w:rPr>
+          <w:rFonts w:ascii="Malgun Gothic" w:cs="Malgun Gothic" w:eastAsia="Malgun Gothic" w:hAnsi="Malgun Gothic"/>
+          <w:b/>
+          <w:bCs/>
+          <w:color w:val="1F3864"/>
+          <w:sz w:val="23"/>
+          <w:szCs w:val="23"/>
+        </w:rPr>
+        <w:t xml:space="preserve">[H-12] ★☆☆   CII·EEXI 같은 운항 규제에는 어떻게 대응합니까?</w:t>
       </w:r>
     </w:p>
     <w:p>
@@ -35816,6 +37680,358 @@
                 <w:sz w:val="17"/>
                 <w:szCs w:val="17"/>
               </w:rPr>
+              <w:t xml:space="preserve">H-5</w:t>
+            </w:r>
+          </w:p>
+        </w:tc>
+        <w:tc>
+          <w:tcPr>
+            <w:tcW w:type="dxa" w:w="3900"/>
+            <w:tcBorders>
+              <w:top w:val="single" w:color="9CA3AF" w:sz="4"/>
+              <w:left w:val="single" w:color="9CA3AF" w:sz="4"/>
+              <w:bottom w:val="single" w:color="9CA3AF" w:sz="4"/>
+              <w:right w:val="single" w:color="9CA3AF" w:sz="4"/>
+            </w:tcBorders>
+            <w:tcMar>
+              <w:top w:type="dxa" w:w="60"/>
+              <w:left w:type="dxa" w:w="100"/>
+              <w:bottom w:type="dxa" w:w="60"/>
+              <w:right w:type="dxa" w:w="100"/>
+            </w:tcMar>
+          </w:tcPr>
+          <w:p>
+            <w:pPr>
+              <w:spacing w:after="0" w:line="270"/>
+              <w:jc w:val="left"/>
+            </w:pPr>
+            <w:r>
+              <w:rPr>
+                <w:rFonts w:ascii="Malgun Gothic" w:cs="Malgun Gothic" w:eastAsia="Malgun Gothic" w:hAnsi="Malgun Gothic"/>
+                <w:b w:val="false"/>
+                <w:bCs w:val="false"/>
+                <w:color w:val="222222"/>
+                <w:sz w:val="17"/>
+                <w:szCs w:val="17"/>
+              </w:rPr>
+              <w:t xml:space="preserve">추력은 총저항의 12.2%인데 제동마력 절감은 8.8%입니다. 왜 다릅니까?</w:t>
+            </w:r>
+          </w:p>
+        </w:tc>
+        <w:tc>
+          <w:tcPr>
+            <w:tcW w:type="dxa" w:w="3038"/>
+            <w:tcBorders>
+              <w:top w:val="single" w:color="9CA3AF" w:sz="4"/>
+              <w:left w:val="single" w:color="9CA3AF" w:sz="4"/>
+              <w:bottom w:val="single" w:color="9CA3AF" w:sz="4"/>
+              <w:right w:val="single" w:color="9CA3AF" w:sz="4"/>
+            </w:tcBorders>
+            <w:tcMar>
+              <w:top w:type="dxa" w:w="60"/>
+              <w:left w:type="dxa" w:w="100"/>
+              <w:bottom w:type="dxa" w:w="60"/>
+              <w:right w:type="dxa" w:w="100"/>
+            </w:tcMar>
+          </w:tcPr>
+          <w:p>
+            <w:pPr>
+              <w:spacing w:after="0" w:line="270"/>
+              <w:jc w:val="left"/>
+            </w:pPr>
+            <w:r>
+              <w:rPr>
+                <w:rFonts w:ascii="Malgun Gothic" w:cs="Malgun Gothic" w:eastAsia="Malgun Gothic" w:hAnsi="Malgun Gothic"/>
+                <w:b w:val="false"/>
+                <w:bCs w:val="false"/>
+                <w:color w:val="222222"/>
+                <w:sz w:val="17"/>
+                <w:szCs w:val="17"/>
+              </w:rPr>
+              <w:t xml:space="preserve"/>
+            </w:r>
+          </w:p>
+        </w:tc>
+        <w:tc>
+          <w:tcPr>
+            <w:tcW w:type="dxa" w:w="1000"/>
+            <w:tcBorders>
+              <w:top w:val="single" w:color="9CA3AF" w:sz="4"/>
+              <w:left w:val="single" w:color="9CA3AF" w:sz="4"/>
+              <w:bottom w:val="single" w:color="9CA3AF" w:sz="4"/>
+              <w:right w:val="single" w:color="9CA3AF" w:sz="4"/>
+            </w:tcBorders>
+            <w:tcMar>
+              <w:top w:type="dxa" w:w="60"/>
+              <w:left w:type="dxa" w:w="100"/>
+              <w:bottom w:type="dxa" w:w="60"/>
+              <w:right w:type="dxa" w:w="100"/>
+            </w:tcMar>
+          </w:tcPr>
+          <w:p>
+            <w:pPr>
+              <w:spacing w:after="0" w:line="270"/>
+              <w:jc w:val="left"/>
+            </w:pPr>
+            <w:r>
+              <w:rPr>
+                <w:rFonts w:ascii="Malgun Gothic" w:cs="Malgun Gothic" w:eastAsia="Malgun Gothic" w:hAnsi="Malgun Gothic"/>
+                <w:b w:val="false"/>
+                <w:bCs w:val="false"/>
+                <w:color w:val="222222"/>
+                <w:sz w:val="17"/>
+                <w:szCs w:val="17"/>
+              </w:rPr>
+              <w:t xml:space="preserve"/>
+            </w:r>
+          </w:p>
+        </w:tc>
+        <w:tc>
+          <w:tcPr>
+            <w:tcW w:type="dxa" w:w="1000"/>
+            <w:tcBorders>
+              <w:top w:val="single" w:color="9CA3AF" w:sz="4"/>
+              <w:left w:val="single" w:color="9CA3AF" w:sz="4"/>
+              <w:bottom w:val="single" w:color="9CA3AF" w:sz="4"/>
+              <w:right w:val="single" w:color="9CA3AF" w:sz="4"/>
+            </w:tcBorders>
+            <w:tcMar>
+              <w:top w:type="dxa" w:w="60"/>
+              <w:left w:type="dxa" w:w="100"/>
+              <w:bottom w:type="dxa" w:w="60"/>
+              <w:right w:type="dxa" w:w="100"/>
+            </w:tcMar>
+          </w:tcPr>
+          <w:p>
+            <w:pPr>
+              <w:spacing w:after="0" w:line="270"/>
+              <w:jc w:val="left"/>
+            </w:pPr>
+            <w:r>
+              <w:rPr>
+                <w:rFonts w:ascii="Malgun Gothic" w:cs="Malgun Gothic" w:eastAsia="Malgun Gothic" w:hAnsi="Malgun Gothic"/>
+                <w:b w:val="false"/>
+                <w:bCs w:val="false"/>
+                <w:color w:val="222222"/>
+                <w:sz w:val="17"/>
+                <w:szCs w:val="17"/>
+              </w:rPr>
+              <w:t xml:space="preserve"/>
+            </w:r>
+          </w:p>
+        </w:tc>
+      </w:tr>
+      <w:tr>
+        <w:trPr>
+          <w:cantSplit/>
+          <w:tblHeader w:val="false"/>
+        </w:trPr>
+        <w:tc>
+          <w:tcPr>
+            <w:tcW w:type="dxa" w:w="700"/>
+            <w:tcBorders>
+              <w:top w:val="single" w:color="9CA3AF" w:sz="4"/>
+              <w:left w:val="single" w:color="9CA3AF" w:sz="4"/>
+              <w:bottom w:val="single" w:color="9CA3AF" w:sz="4"/>
+              <w:right w:val="single" w:color="9CA3AF" w:sz="4"/>
+            </w:tcBorders>
+            <w:tcMar>
+              <w:top w:type="dxa" w:w="60"/>
+              <w:left w:type="dxa" w:w="100"/>
+              <w:bottom w:type="dxa" w:w="60"/>
+              <w:right w:type="dxa" w:w="100"/>
+            </w:tcMar>
+          </w:tcPr>
+          <w:p>
+            <w:pPr>
+              <w:spacing w:after="0" w:line="270"/>
+              <w:jc w:val="left"/>
+            </w:pPr>
+            <w:r>
+              <w:rPr>
+                <w:rFonts w:ascii="Malgun Gothic" w:cs="Malgun Gothic" w:eastAsia="Malgun Gothic" w:hAnsi="Malgun Gothic"/>
+                <w:b/>
+                <w:bCs/>
+                <w:color w:val="222222"/>
+                <w:sz w:val="17"/>
+                <w:szCs w:val="17"/>
+              </w:rPr>
+              <w:t xml:space="preserve">H-6</w:t>
+            </w:r>
+          </w:p>
+        </w:tc>
+        <w:tc>
+          <w:tcPr>
+            <w:tcW w:type="dxa" w:w="3900"/>
+            <w:tcBorders>
+              <w:top w:val="single" w:color="9CA3AF" w:sz="4"/>
+              <w:left w:val="single" w:color="9CA3AF" w:sz="4"/>
+              <w:bottom w:val="single" w:color="9CA3AF" w:sz="4"/>
+              <w:right w:val="single" w:color="9CA3AF" w:sz="4"/>
+            </w:tcBorders>
+            <w:tcMar>
+              <w:top w:type="dxa" w:w="60"/>
+              <w:left w:type="dxa" w:w="100"/>
+              <w:bottom w:type="dxa" w:w="60"/>
+              <w:right w:type="dxa" w:w="100"/>
+            </w:tcMar>
+          </w:tcPr>
+          <w:p>
+            <w:pPr>
+              <w:spacing w:after="0" w:line="270"/>
+              <w:jc w:val="left"/>
+            </w:pPr>
+            <w:r>
+              <w:rPr>
+                <w:rFonts w:ascii="Malgun Gothic" w:cs="Malgun Gothic" w:eastAsia="Malgun Gothic" w:hAnsi="Malgun Gothic"/>
+                <w:b w:val="false"/>
+                <w:bCs w:val="false"/>
+                <w:color w:val="222222"/>
+                <w:sz w:val="17"/>
+                <w:szCs w:val="17"/>
+              </w:rPr>
+              <w:t xml:space="preserve">로터세일 구동 전력(115 kW × 3기)은 절감량에서 뺐습니까?</w:t>
+            </w:r>
+          </w:p>
+        </w:tc>
+        <w:tc>
+          <w:tcPr>
+            <w:tcW w:type="dxa" w:w="3038"/>
+            <w:tcBorders>
+              <w:top w:val="single" w:color="9CA3AF" w:sz="4"/>
+              <w:left w:val="single" w:color="9CA3AF" w:sz="4"/>
+              <w:bottom w:val="single" w:color="9CA3AF" w:sz="4"/>
+              <w:right w:val="single" w:color="9CA3AF" w:sz="4"/>
+            </w:tcBorders>
+            <w:tcMar>
+              <w:top w:type="dxa" w:w="60"/>
+              <w:left w:type="dxa" w:w="100"/>
+              <w:bottom w:type="dxa" w:w="60"/>
+              <w:right w:type="dxa" w:w="100"/>
+            </w:tcMar>
+          </w:tcPr>
+          <w:p>
+            <w:pPr>
+              <w:spacing w:after="0" w:line="270"/>
+              <w:jc w:val="left"/>
+            </w:pPr>
+            <w:r>
+              <w:rPr>
+                <w:rFonts w:ascii="Malgun Gothic" w:cs="Malgun Gothic" w:eastAsia="Malgun Gothic" w:hAnsi="Malgun Gothic"/>
+                <w:b w:val="false"/>
+                <w:bCs w:val="false"/>
+                <w:color w:val="222222"/>
+                <w:sz w:val="17"/>
+                <w:szCs w:val="17"/>
+              </w:rPr>
+              <w:t xml:space="preserve"/>
+            </w:r>
+          </w:p>
+        </w:tc>
+        <w:tc>
+          <w:tcPr>
+            <w:tcW w:type="dxa" w:w="1000"/>
+            <w:tcBorders>
+              <w:top w:val="single" w:color="9CA3AF" w:sz="4"/>
+              <w:left w:val="single" w:color="9CA3AF" w:sz="4"/>
+              <w:bottom w:val="single" w:color="9CA3AF" w:sz="4"/>
+              <w:right w:val="single" w:color="9CA3AF" w:sz="4"/>
+            </w:tcBorders>
+            <w:tcMar>
+              <w:top w:type="dxa" w:w="60"/>
+              <w:left w:type="dxa" w:w="100"/>
+              <w:bottom w:type="dxa" w:w="60"/>
+              <w:right w:type="dxa" w:w="100"/>
+            </w:tcMar>
+          </w:tcPr>
+          <w:p>
+            <w:pPr>
+              <w:spacing w:after="0" w:line="270"/>
+              <w:jc w:val="left"/>
+            </w:pPr>
+            <w:r>
+              <w:rPr>
+                <w:rFonts w:ascii="Malgun Gothic" w:cs="Malgun Gothic" w:eastAsia="Malgun Gothic" w:hAnsi="Malgun Gothic"/>
+                <w:b w:val="false"/>
+                <w:bCs w:val="false"/>
+                <w:color w:val="222222"/>
+                <w:sz w:val="17"/>
+                <w:szCs w:val="17"/>
+              </w:rPr>
+              <w:t xml:space="preserve"/>
+            </w:r>
+          </w:p>
+        </w:tc>
+        <w:tc>
+          <w:tcPr>
+            <w:tcW w:type="dxa" w:w="1000"/>
+            <w:tcBorders>
+              <w:top w:val="single" w:color="9CA3AF" w:sz="4"/>
+              <w:left w:val="single" w:color="9CA3AF" w:sz="4"/>
+              <w:bottom w:val="single" w:color="9CA3AF" w:sz="4"/>
+              <w:right w:val="single" w:color="9CA3AF" w:sz="4"/>
+            </w:tcBorders>
+            <w:tcMar>
+              <w:top w:type="dxa" w:w="60"/>
+              <w:left w:type="dxa" w:w="100"/>
+              <w:bottom w:type="dxa" w:w="60"/>
+              <w:right w:type="dxa" w:w="100"/>
+            </w:tcMar>
+          </w:tcPr>
+          <w:p>
+            <w:pPr>
+              <w:spacing w:after="0" w:line="270"/>
+              <w:jc w:val="left"/>
+            </w:pPr>
+            <w:r>
+              <w:rPr>
+                <w:rFonts w:ascii="Malgun Gothic" w:cs="Malgun Gothic" w:eastAsia="Malgun Gothic" w:hAnsi="Malgun Gothic"/>
+                <w:b w:val="false"/>
+                <w:bCs w:val="false"/>
+                <w:color w:val="222222"/>
+                <w:sz w:val="17"/>
+                <w:szCs w:val="17"/>
+              </w:rPr>
+              <w:t xml:space="preserve"/>
+            </w:r>
+          </w:p>
+        </w:tc>
+      </w:tr>
+      <w:tr>
+        <w:trPr>
+          <w:cantSplit/>
+          <w:tblHeader w:val="false"/>
+        </w:trPr>
+        <w:tc>
+          <w:tcPr>
+            <w:tcW w:type="dxa" w:w="700"/>
+            <w:tcBorders>
+              <w:top w:val="single" w:color="9CA3AF" w:sz="4"/>
+              <w:left w:val="single" w:color="9CA3AF" w:sz="4"/>
+              <w:bottom w:val="single" w:color="9CA3AF" w:sz="4"/>
+              <w:right w:val="single" w:color="9CA3AF" w:sz="4"/>
+            </w:tcBorders>
+            <w:tcMar>
+              <w:top w:type="dxa" w:w="60"/>
+              <w:left w:type="dxa" w:w="100"/>
+              <w:bottom w:type="dxa" w:w="60"/>
+              <w:right w:type="dxa" w:w="100"/>
+            </w:tcMar>
+          </w:tcPr>
+          <w:p>
+            <w:pPr>
+              <w:spacing w:after="0" w:line="270"/>
+              <w:jc w:val="left"/>
+            </w:pPr>
+            <w:r>
+              <w:rPr>
+                <w:rFonts w:ascii="Malgun Gothic" w:cs="Malgun Gothic" w:eastAsia="Malgun Gothic" w:hAnsi="Malgun Gothic"/>
+                <w:b/>
+                <w:bCs/>
+                <w:color w:val="222222"/>
+                <w:sz w:val="17"/>
+                <w:szCs w:val="17"/>
+              </w:rPr>
               <w:t xml:space="preserve">I-2</w:t>
             </w:r>
           </w:p>
@@ -38228,7 +40444,81 @@
                 <w:sz w:val="18"/>
                 <w:szCs w:val="18"/>
               </w:rPr>
-              <w:t xml:space="preserve">U10 7.0 m/s, 추력 82.1 kN (12.2%), 725 kW (NCR 8.8%), 메탄올 1,376 t · CO₂ 2,040 t/년</w:t>
+              <w:t xml:space="preserve">U10 7.0 m/s (문헌 3종 6.5~8.3 중앙값), 추력 82.1 kN (총저항 673.69 kN의 12.2%), 725 kW (NCR 8,201.6의 8.8%), 메탄올 1,376 t · CO₂ 2,040 t/년 (연 250일 기준)</w:t>
+            </w:r>
+          </w:p>
+        </w:tc>
+      </w:tr>
+      <w:tr>
+        <w:trPr>
+          <w:cantSplit/>
+          <w:tblHeader w:val="false"/>
+        </w:trPr>
+        <w:tc>
+          <w:tcPr>
+            <w:tcW w:type="dxa" w:w="2500"/>
+            <w:tcBorders>
+              <w:top w:val="single" w:color="9CA3AF" w:sz="4"/>
+              <w:left w:val="single" w:color="9CA3AF" w:sz="4"/>
+              <w:bottom w:val="single" w:color="9CA3AF" w:sz="4"/>
+              <w:right w:val="single" w:color="9CA3AF" w:sz="4"/>
+            </w:tcBorders>
+            <w:tcMar>
+              <w:top w:type="dxa" w:w="60"/>
+              <w:left w:type="dxa" w:w="100"/>
+              <w:bottom w:type="dxa" w:w="60"/>
+              <w:right w:type="dxa" w:w="100"/>
+            </w:tcMar>
+          </w:tcPr>
+          <w:p>
+            <w:pPr>
+              <w:spacing w:after="0" w:line="270"/>
+              <w:jc w:val="left"/>
+            </w:pPr>
+            <w:r>
+              <w:rPr>
+                <w:rFonts w:ascii="Malgun Gothic" w:cs="Malgun Gothic" w:eastAsia="Malgun Gothic" w:hAnsi="Malgun Gothic"/>
+                <w:b w:val="false"/>
+                <w:bCs w:val="false"/>
+                <w:color w:val="222222"/>
+                <w:sz w:val="18"/>
+                <w:szCs w:val="18"/>
+              </w:rPr>
+              <w:t xml:space="preserve">로터세일 검증 포인트</w:t>
+            </w:r>
+          </w:p>
+        </w:tc>
+        <w:tc>
+          <w:tcPr>
+            <w:tcW w:type="dxa" w:w="7138"/>
+            <w:tcBorders>
+              <w:top w:val="single" w:color="9CA3AF" w:sz="4"/>
+              <w:left w:val="single" w:color="9CA3AF" w:sz="4"/>
+              <w:bottom w:val="single" w:color="9CA3AF" w:sz="4"/>
+              <w:right w:val="single" w:color="9CA3AF" w:sz="4"/>
+            </w:tcBorders>
+            <w:tcMar>
+              <w:top w:type="dxa" w:w="60"/>
+              <w:left w:type="dxa" w:w="100"/>
+              <w:bottom w:type="dxa" w:w="60"/>
+              <w:right w:type="dxa" w:w="100"/>
+            </w:tcMar>
+          </w:tcPr>
+          <w:p>
+            <w:pPr>
+              <w:spacing w:after="0" w:line="270"/>
+              <w:jc w:val="left"/>
+            </w:pPr>
+            <w:r>
+              <w:rPr>
+                <w:rFonts w:ascii="Malgun Gothic" w:cs="Malgun Gothic" w:eastAsia="Malgun Gothic" w:hAnsi="Malgun Gothic"/>
+                <w:b w:val="false"/>
+                <w:bCs w:val="false"/>
+                <w:color w:val="222222"/>
+                <w:sz w:val="18"/>
+                <w:szCs w:val="18"/>
+              </w:rPr>
+              <w:t xml:space="preserve">카탈로그 205 kN은 17~23 m/s 기준 · 구동전력 115 kW×3 미차감 (전부 빼도 380 kW, 4.6%) · 귀항 TWA 36.2°에서 횡력 114 kN = 추력의 7.1배 · 실선 8.2/9.1/6.5~8.9%, Jones 2.03%</w:t>
             </w:r>
           </w:p>
         </w:tc>

</xml_diff>

<commit_message>
Pre-empt rotor-sail and design-limit questions on slides 15-16
Slide 15: state that the saving survives netting out full rotor motor
power (345 kW -> >=380 kW, 4.6% of NCR), widen the field-data comparison to
the 6.5-9.1% range with a note on the 2% weak-wind case, and say the wind
input is measured route data. Slide 16: add a follow-up-work line
(cavitation check, rotor foundation and wind-load manoeuvring, loading-
manual-based still-water loads) so the team names its own limits first.
Script trimmed elsewhere to keep the deck under ten minutes.

Co-Authored-By: Claude Fable 5.1 <noreply@anthropic.com>
Claude-Session: https://claude.ai/code/session_01KYxRjEufxoxoFhSS4GKPUN
</commit_message>
<xml_diff>
--- a/contest/presentation/2026_74K_발표대본_질의응답.docx
+++ b/contest/presentation/2026_74K_발표대본_질의응답.docx
@@ -297,7 +297,7 @@
           <w:sz w:val="21"/>
           <w:szCs w:val="21"/>
         </w:rPr>
-        <w:t xml:space="preserve">총 발화량 약 2351 음절 · 보통 속도(분당 280 음절) 기준 순수 발화 8:24 + 슬라이드 전환·호흡 0:43 = </w:t>
+        <w:t xml:space="preserve">총 발화량 약 2346 음절 · 보통 속도(분당 280 음절) 기준 순수 발화 8:23 + 슬라이드 전환·호흡 0:43 = </w:t>
       </w:r>
       <w:r>
         <w:rPr>
@@ -308,7 +308,7 @@
           <w:sz w:val="21"/>
           <w:szCs w:val="21"/>
         </w:rPr>
-        <w:t xml:space="preserve">예상 9:06</w:t>
+        <w:t xml:space="preserve">예상 9:05</w:t>
       </w:r>
       <w:r>
         <w:rPr>
@@ -799,7 +799,7 @@
                 <w:sz w:val="18"/>
                 <w:szCs w:val="18"/>
               </w:rPr>
-              <w:t xml:space="preserve">30</w:t>
+              <w:t xml:space="preserve">29</w:t>
             </w:r>
           </w:p>
         </w:tc>
@@ -833,7 +833,7 @@
                 <w:sz w:val="18"/>
                 <w:szCs w:val="18"/>
               </w:rPr>
-              <w:t xml:space="preserve">0:50</w:t>
+              <w:t xml:space="preserve">0:49</w:t>
             </w:r>
           </w:p>
         </w:tc>
@@ -1009,7 +1009,7 @@
                 <w:sz w:val="18"/>
                 <w:szCs w:val="18"/>
               </w:rPr>
-              <w:t xml:space="preserve">1:27</w:t>
+              <w:t xml:space="preserve">1:26</w:t>
             </w:r>
           </w:p>
         </w:tc>
@@ -1185,7 +1185,7 @@
                 <w:sz w:val="18"/>
                 <w:szCs w:val="18"/>
               </w:rPr>
-              <w:t xml:space="preserve">1:59</w:t>
+              <w:t xml:space="preserve">1:58</w:t>
             </w:r>
           </w:p>
         </w:tc>
@@ -1361,7 +1361,7 @@
                 <w:sz w:val="18"/>
                 <w:szCs w:val="18"/>
               </w:rPr>
-              <w:t xml:space="preserve">2:33</w:t>
+              <w:t xml:space="preserve">2:32</w:t>
             </w:r>
           </w:p>
         </w:tc>
@@ -1503,7 +1503,7 @@
                 <w:sz w:val="18"/>
                 <w:szCs w:val="18"/>
               </w:rPr>
-              <w:t xml:space="preserve">30</w:t>
+              <w:t xml:space="preserve">29</w:t>
             </w:r>
           </w:p>
         </w:tc>
@@ -1537,7 +1537,7 @@
                 <w:sz w:val="18"/>
                 <w:szCs w:val="18"/>
               </w:rPr>
-              <w:t xml:space="preserve">3:05</w:t>
+              <w:t xml:space="preserve">3:03</w:t>
             </w:r>
           </w:p>
         </w:tc>
@@ -1679,7 +1679,7 @@
                 <w:sz w:val="18"/>
                 <w:szCs w:val="18"/>
               </w:rPr>
-              <w:t xml:space="preserve">42</w:t>
+              <w:t xml:space="preserve">41</w:t>
             </w:r>
           </w:p>
         </w:tc>
@@ -1713,7 +1713,7 @@
                 <w:sz w:val="18"/>
                 <w:szCs w:val="18"/>
               </w:rPr>
-              <w:t xml:space="preserve">3:50</w:t>
+              <w:t xml:space="preserve">3:47</w:t>
             </w:r>
           </w:p>
         </w:tc>
@@ -1889,7 +1889,7 @@
                 <w:sz w:val="18"/>
                 <w:szCs w:val="18"/>
               </w:rPr>
-              <w:t xml:space="preserve">4:21</w:t>
+              <w:t xml:space="preserve">4:18</w:t>
             </w:r>
           </w:p>
         </w:tc>
@@ -2031,7 +2031,7 @@
                 <w:sz w:val="18"/>
                 <w:szCs w:val="18"/>
               </w:rPr>
-              <w:t xml:space="preserve">27</w:t>
+              <w:t xml:space="preserve">26</w:t>
             </w:r>
           </w:p>
         </w:tc>
@@ -2065,7 +2065,7 @@
                 <w:sz w:val="18"/>
                 <w:szCs w:val="18"/>
               </w:rPr>
-              <w:t xml:space="preserve">4:51</w:t>
+              <w:t xml:space="preserve">4:47</w:t>
             </w:r>
           </w:p>
         </w:tc>
@@ -2241,7 +2241,7 @@
                 <w:sz w:val="18"/>
                 <w:szCs w:val="18"/>
               </w:rPr>
-              <w:t xml:space="preserve">5:24</w:t>
+              <w:t xml:space="preserve">5:20</w:t>
             </w:r>
           </w:p>
         </w:tc>
@@ -2383,7 +2383,7 @@
                 <w:sz w:val="18"/>
                 <w:szCs w:val="18"/>
               </w:rPr>
-              <w:t xml:space="preserve">36</w:t>
+              <w:t xml:space="preserve">34</w:t>
             </w:r>
           </w:p>
         </w:tc>
@@ -2417,7 +2417,7 @@
                 <w:sz w:val="18"/>
                 <w:szCs w:val="18"/>
               </w:rPr>
-              <w:t xml:space="preserve">6:03</w:t>
+              <w:t xml:space="preserve">5:57</w:t>
             </w:r>
           </w:p>
         </w:tc>
@@ -2559,7 +2559,7 @@
                 <w:sz w:val="18"/>
                 <w:szCs w:val="18"/>
               </w:rPr>
-              <w:t xml:space="preserve">31</w:t>
+              <w:t xml:space="preserve">29</w:t>
             </w:r>
           </w:p>
         </w:tc>
@@ -2593,7 +2593,7 @@
                 <w:sz w:val="18"/>
                 <w:szCs w:val="18"/>
               </w:rPr>
-              <w:t xml:space="preserve">6:36</w:t>
+              <w:t xml:space="preserve">6:28</w:t>
             </w:r>
           </w:p>
         </w:tc>
@@ -2769,7 +2769,7 @@
                 <w:sz w:val="18"/>
                 <w:szCs w:val="18"/>
               </w:rPr>
-              <w:t xml:space="preserve">7:11</w:t>
+              <w:t xml:space="preserve">7:03</w:t>
             </w:r>
           </w:p>
         </w:tc>
@@ -2945,7 +2945,7 @@
                 <w:sz w:val="18"/>
                 <w:szCs w:val="18"/>
               </w:rPr>
-              <w:t xml:space="preserve">7:50</w:t>
+              <w:t xml:space="preserve">7:42</w:t>
             </w:r>
           </w:p>
         </w:tc>
@@ -3121,7 +3121,7 @@
                 <w:sz w:val="18"/>
                 <w:szCs w:val="18"/>
               </w:rPr>
-              <w:t xml:space="preserve">8:25</w:t>
+              <w:t xml:space="preserve">8:17</w:t>
             </w:r>
           </w:p>
         </w:tc>
@@ -3263,7 +3263,7 @@
                 <w:sz w:val="18"/>
                 <w:szCs w:val="18"/>
               </w:rPr>
-              <w:t xml:space="preserve">35</w:t>
+              <w:t xml:space="preserve">41</w:t>
             </w:r>
           </w:p>
         </w:tc>
@@ -3297,7 +3297,7 @@
                 <w:sz w:val="18"/>
                 <w:szCs w:val="18"/>
               </w:rPr>
-              <w:t xml:space="preserve">9:02</w:t>
+              <w:t xml:space="preserve">9:00</w:t>
             </w:r>
           </w:p>
         </w:tc>
@@ -3473,7 +3473,7 @@
                 <w:sz w:val="18"/>
                 <w:szCs w:val="18"/>
               </w:rPr>
-              <w:t xml:space="preserve">9:09</w:t>
+              <w:t xml:space="preserve">9:07</w:t>
             </w:r>
           </w:p>
         </w:tc>
@@ -3615,7 +3615,7 @@
                 <w:sz w:val="18"/>
                 <w:szCs w:val="18"/>
               </w:rPr>
-              <w:t xml:space="preserve">506</w:t>
+              <w:t xml:space="preserve">504</w:t>
             </w:r>
           </w:p>
         </w:tc>
@@ -3649,7 +3649,7 @@
                 <w:sz w:val="18"/>
                 <w:szCs w:val="18"/>
               </w:rPr>
-              <w:t xml:space="preserve">9:09</w:t>
+              <w:t xml:space="preserve">9:07</w:t>
             </w:r>
           </w:p>
         </w:tc>
@@ -3725,7 +3725,7 @@
           <w:sz w:val="21"/>
           <w:szCs w:val="21"/>
         </w:rPr>
-        <w:t xml:space="preserve">느리게(또박또박) 9:56  ·  약간 느리게 9:25  ·  보통 9:06  ·  빠르게 8:33</w:t>
+        <w:t xml:space="preserve">느리게(또박또박) 9:54  ·  약간 느리게 9:24  ·  보통 9:05  ·  빠르게 8:32</w:t>
       </w:r>
     </w:p>
     <w:p>
@@ -4405,7 +4405,7 @@
           <w:sz w:val="23"/>
           <w:szCs w:val="23"/>
         </w:rPr>
-        <w:t xml:space="preserve">슬라이드 2  —  목차 및 설계 컨셉     [30초 · 누적 0:50]</w:t>
+        <w:t xml:space="preserve">슬라이드 2  —  목차 및 설계 컨셉     [29초 · 누적 0:49]</w:t>
       </w:r>
     </w:p>
     <w:p>
@@ -4483,7 +4483,7 @@
                 <w:sz w:val="23"/>
                 <w:szCs w:val="23"/>
               </w:rPr>
-              <w:t xml:space="preserve">발표는 개념 설계부터 친환경까지 일곱 섹션 순으로 진행하겠습니다. 본 설계선의 핵심은 세 가지입니다. 첫째, 메탄올 이중연료입니다. LNG의 극저온 탱크 부담도, 저유황유의 세정장치도 없이 북미 배출규제해역 기준을 충족합니다. 둘째는 축발전기와 로터 세일을 통한 EEDI Phase 3 대응, 셋째는 단거리 TD9 항로 전략입니다.</w:t>
+              <w:t xml:space="preserve">발표는 개념 설계부터 친환경까지 일곱 섹션 순으로 진행하겠습니다. 핵심은 세 가지입니다. 첫째, 메탄올 이중연료입니다. LNG의 극저온 탱크 부담도, 저유황유의 세정장치도 없이 북미 배출규제해역 기준을 충족합니다. 둘째는 축발전기와 로터 세일을 통한 EEDI Phase 3 대응, 셋째는 단거리 TD9 항로 전략입니다.</w:t>
             </w:r>
           </w:p>
         </w:tc>
@@ -4532,7 +4532,7 @@
           <w:sz w:val="23"/>
           <w:szCs w:val="23"/>
         </w:rPr>
-        <w:t xml:space="preserve">슬라이드 3  —  01 개념설계 - 항로 및 화물 선정     [34초 · 누적 1:27]</w:t>
+        <w:t xml:space="preserve">슬라이드 3  —  01 개념설계 - 항로 및 화물 선정     [34초 · 누적 1:26]</w:t>
       </w:r>
     </w:p>
     <w:p>
@@ -4610,7 +4610,7 @@
                 <w:sz w:val="23"/>
                 <w:szCs w:val="23"/>
               </w:rPr>
-              <w:t xml:space="preserve">먼저 항로 선정입니다. 메탄올 벙커링이 가능하고 미국 최대 원유 수출항인 Corpus Christi를 공통 양하항으로 두고 세 항로를 비교했습니다. 콜롬비아 Conveñas 항로는 본선 규격과 일치하는 공인 운임지수 TD9가 있고 물동량도 가장 많습니다. 특히 편도 1,652해리 단거리라 메탄올 탱크가 만재 배수용적의 1.1퍼센트에 그쳐, 메탄올 추진의 약점인 적재량 손실을 해소합니다.</w:t>
+              <w:t xml:space="preserve">먼저 항로 선정입니다. 미국 최대 원유 수출항이자 메탄올 벙커링이 가능한 Corpus Christi를 공통 양하항으로 두고 세 항로를 비교했습니다. 콜롬비아 Conveñas 항로는 본선 규격과 일치하는 공인 운임지수 TD9가 있고 물동량도 가장 많습니다. 특히 편도 1,652해리 단거리라 메탄올 탱크가 만재 배수용적의 1.1퍼센트에 그쳐, 메탄올 추진의 약점인 적재량 손실을 해소합니다.</w:t>
             </w:r>
           </w:p>
         </w:tc>
@@ -4659,7 +4659,7 @@
           <w:sz w:val="23"/>
           <w:szCs w:val="23"/>
         </w:rPr>
-        <w:t xml:space="preserve">슬라이드 4  —  02 선형설계 - 제원 추정 및 선형 변환     [30초 · 누적 1:59]</w:t>
+        <w:t xml:space="preserve">슬라이드 4  —  02 선형설계 - 제원 추정 및 선형 변환     [30초 · 누적 1:58]</w:t>
       </w:r>
     </w:p>
     <w:p>
@@ -4786,7 +4786,7 @@
           <w:sz w:val="23"/>
           <w:szCs w:val="23"/>
         </w:rPr>
-        <w:t xml:space="preserve">슬라이드 5  —  02 선형설계 - 선수·선미 형상 및 CFD     [31초 · 누적 2:33]</w:t>
+        <w:t xml:space="preserve">슬라이드 5  —  02 선형설계 - 선수·선미 형상 및 CFD     [31초 · 누적 2:32]</w:t>
       </w:r>
     </w:p>
     <w:p>
@@ -4913,7 +4913,7 @@
           <w:sz w:val="23"/>
           <w:szCs w:val="23"/>
         </w:rPr>
-        <w:t xml:space="preserve">슬라이드 6  —  03 추진 - 저항·마력 및 Design Speed     [30초 · 누적 3:05]</w:t>
+        <w:t xml:space="preserve">슬라이드 6  —  03 추진 - 저항·마력 및 Design Speed     [29초 · 누적 3:03]</w:t>
       </w:r>
     </w:p>
     <w:p>
@@ -4991,7 +4991,7 @@
                 <w:sz w:val="23"/>
                 <w:szCs w:val="23"/>
               </w:rPr>
-              <w:t xml:space="preserve">저항은 Holtrop-Mennen 경험식을 CFD 및 ITTC 1978 실선 확장 결과와 비교해 보정계수 0.7315를 산출해 적용했습니다. 설계속도는 연료비와 항차수 증가에 따른 운임 수익을 함께 반영해, 연간 순이익이 최대가 되는 14.3노트로 선정했습니다. 이때 추정된 소요 마력은 약 9,650킬로와트입니다.</w:t>
+              <w:t xml:space="preserve">저항은 Holtrop-Mennen 경험식을 CFD 및 ITTC 1978 실선 확장 결과와 비교해 보정계수 0.7315를 산출해 적용했습니다. 설계속도는 연료비와 항차수 증가에 따른 운임 수익을 함께 반영해, 연간 순이익이 최대가 되는 14.3노트로 선정했습니다. 추정 소요 마력은 약 9,650킬로와트입니다.</w:t>
             </w:r>
           </w:p>
         </w:tc>
@@ -5040,7 +5040,7 @@
           <w:sz w:val="23"/>
           <w:szCs w:val="23"/>
         </w:rPr>
-        <w:t xml:space="preserve">슬라이드 7  —  03 추진 - 주기관 및 축발전기     [42초 · 누적 3:50]</w:t>
+        <w:t xml:space="preserve">슬라이드 7  —  03 추진 - 주기관 및 축발전기     [41초 · 누적 3:47]</w:t>
       </w:r>
     </w:p>
     <w:p>
@@ -5118,7 +5118,7 @@
                 <w:sz w:val="23"/>
                 <w:szCs w:val="23"/>
               </w:rPr>
-              <w:t xml:space="preserve">주기관은 메탄올 이중연료 운전이 가능한 5G60ME-C10.5-LGIM을 선정했습니다. 앞서 추정한 마력이 MEPC 최소추진마력 10,840킬로와트에 못 미쳐, 이를 상회하는 SMCR 10,890킬로와트로 결정했습니다. 질소산화물은 EGRTC로 대응하고, 축발전기 1,000킬로와트로 항해 중 보조기관 가동을 최소화했습니다. 이것만으로 EEDI가 4.411에서 3.580까지 내려갑니다.</w:t>
+              <w:t xml:space="preserve">주기관은 메탄올 이중연료 5G60ME-C10.5-LGIM을 선정했습니다. 앞서 추정한 마력이 MEPC 최소추진마력 10,840킬로와트에 못 미쳐, 이를 상회하는 SMCR 10,890킬로와트로 결정했습니다. 질소산화물은 EGRTC로 대응하고, 축발전기 1,000킬로와트로 항해 중 보조기관 가동을 최소화했습니다. 이것만으로 EEDI가 4.411에서 3.580까지 내려갑니다.</w:t>
             </w:r>
           </w:p>
         </w:tc>
@@ -5167,7 +5167,7 @@
           <w:sz w:val="23"/>
           <w:szCs w:val="23"/>
         </w:rPr>
-        <w:t xml:space="preserve">슬라이드 8  —  03 추진 - 프로펠러 설계     [29초 · 누적 4:21]</w:t>
+        <w:t xml:space="preserve">슬라이드 8  —  03 추진 - 프로펠러 설계     [29초 · 누적 4:18]</w:t>
       </w:r>
     </w:p>
     <w:p>
@@ -5294,7 +5294,7 @@
           <w:sz w:val="23"/>
           <w:szCs w:val="23"/>
         </w:rPr>
-        <w:t xml:space="preserve">슬라이드 9  —  03 조종 - 타 설계 및 조종성능     [27초 · 누적 4:51]</w:t>
+        <w:t xml:space="preserve">슬라이드 9  —  03 조종 - 타 설계 및 조종성능     [26초 · 누적 4:47]</w:t>
       </w:r>
     </w:p>
     <w:p>
@@ -5372,7 +5372,7 @@
                 <w:sz w:val="23"/>
                 <w:szCs w:val="23"/>
               </w:rPr>
-              <w:t xml:space="preserve">타 면적은 네 가지 추정법의 결과 범위 안에서 42.83제곱미터로 정하고, 제작이 용이한 NACA 단면의 Semi-spade 타를 채택했습니다. 프로펠러·선체 간 간격도 기준을 만족합니다. 조종성능은 두 흘수 조건에서 선회, 지그재그, 크래시 스톱, 나선 시험을 수행했고 전 항목이 IMO 기준을 만족했습니다.</w:t>
+              <w:t xml:space="preserve">타 면적은 네 가지 추정법의 결과 범위 안에서 42.83제곱미터로 정하고, NACA 단면의 Semi-spade 타를 채택했습니다. 프로펠러·선체 간 간격도 기준을 만족합니다. 조종성능은 두 흘수 조건에서 선회, 지그재그, 크래시 스톱, 나선 시험을 수행했고 전 항목이 IMO 기준을 만족했습니다.</w:t>
             </w:r>
           </w:p>
         </w:tc>
@@ -5421,7 +5421,7 @@
           <w:sz w:val="23"/>
           <w:szCs w:val="23"/>
         </w:rPr>
-        <w:t xml:space="preserve">슬라이드 10  —  04 구획 - 격벽·기관실·메탄올 탱크     [31초 · 누적 5:24]</w:t>
+        <w:t xml:space="preserve">슬라이드 10  —  04 구획 - 격벽·기관실·메탄올 탱크     [31초 · 누적 5:20]</w:t>
       </w:r>
     </w:p>
     <w:p>
@@ -5548,7 +5548,7 @@
           <w:sz w:val="23"/>
           <w:szCs w:val="23"/>
         </w:rPr>
-        <w:t xml:space="preserve">슬라이드 11  —  04 구획 - 화물창 및 가시거리     [36초 · 누적 6:03]</w:t>
+        <w:t xml:space="preserve">슬라이드 11  —  04 구획 - 화물창 및 가시거리     [34초 · 누적 5:57]</w:t>
       </w:r>
     </w:p>
     <w:p>
@@ -5626,7 +5626,7 @@
                 <w:sz w:val="23"/>
                 <w:szCs w:val="23"/>
               </w:rPr>
-              <w:t xml:space="preserve">화물창은 MARPOL에 따라 윙탱크 폭과 이중저 높이를 각각 2.4미터로 한 이중선체이며, 총 용적 77,839세제곱미터입니다. 가상 기름 유출량과 슬롭탱크 용량도 규정 이내입니다. 건현은 ICLL 기준 허용 만재흘수 16.4미터로 스캔틀링 흘수를 상회하고, 의장수 2,559로 앵커와 체인을 결정했습니다. 가시거리도 전 흘수 조건에서 SOLAS 규정을 만족합니다.</w:t>
+              <w:t xml:space="preserve">화물창은 MARPOL에 따라 윙탱크 폭과 이중저 높이를 각각 2.4미터로 한 이중선체이며, 총 용적 77,839세제곱미터입니다. 가상 기름 유출량과 슬롭탱크 용량도 규정 이내입니다. 건현은 ICLL 기준 허용 만재흘수 16.4미터로 스캔틀링 흘수를 상회하고, 의장수 2,559로 앵커와 체인을 결정했습니다. 가시거리도 SOLAS 규정을 만족합니다.</w:t>
             </w:r>
           </w:p>
         </w:tc>
@@ -5675,7 +5675,7 @@
           <w:sz w:val="23"/>
           <w:szCs w:val="23"/>
         </w:rPr>
-        <w:t xml:space="preserve">슬라이드 12  —  05 복원성     [31초 · 누적 6:36]</w:t>
+        <w:t xml:space="preserve">슬라이드 12  —  05 복원성     [29초 · 누적 6:28]</w:t>
       </w:r>
     </w:p>
     <w:p>
@@ -5753,7 +5753,7 @@
                 <w:sz w:val="23"/>
                 <w:szCs w:val="23"/>
               </w:rPr>
-              <w:t xml:space="preserve">복원성입니다. 경하중량은 로터 세일을 포함해 14,724톤이며, 경하부터 만재까지 출항과 도착을 나눈 열 가지 적재조건을 검토했습니다. 모든 조건에서 IS Code 2008 비손상 기준과 종강도 허용치를 만족했습니다. 손상 복원성은 MARPOL 28규칙의 네 가지 손상 케이스 전부에서 잔존복원성 기준을 만족했습니다.</w:t>
+              <w:t xml:space="preserve">복원성입니다. 경하중량은 로터 세일을 포함해 14,724톤이며, 경하부터 만재까지 열 가지 적재조건을 검토했습니다. 모든 조건에서 IS Code 2008 비손상 기준과 종강도 허용치를 만족했습니다. 손상 복원성은 MARPOL 28규칙의 네 가지 손상 케이스 전부에서 잔존복원성 기준을 만족했습니다.</w:t>
             </w:r>
           </w:p>
         </w:tc>
@@ -5802,7 +5802,7 @@
           <w:sz w:val="23"/>
           <w:szCs w:val="23"/>
         </w:rPr>
-        <w:t xml:space="preserve">슬라이드 13  —  06 구조설계 - CSR 규정 구현 및 치수 결정     [32초 · 누적 7:11]</w:t>
+        <w:t xml:space="preserve">슬라이드 13  —  06 구조설계 - CSR 규정 구현 및 치수 결정     [32초 · 누적 7:03]</w:t>
       </w:r>
     </w:p>
     <w:p>
@@ -5929,7 +5929,7 @@
           <w:sz w:val="23"/>
           <w:szCs w:val="23"/>
         </w:rPr>
-        <w:t xml:space="preserve">슬라이드 14  —  06 구조설계 - 좌굴·강도 검증 및 교차검증     [37초 · 누적 7:50]</w:t>
+        <w:t xml:space="preserve">슬라이드 14  —  06 구조설계 - 좌굴·강도 검증 및 교차검증     [37초 · 누적 7:42]</w:t>
       </w:r>
     </w:p>
     <w:p>
@@ -6056,7 +6056,7 @@
           <w:sz w:val="23"/>
           <w:szCs w:val="23"/>
         </w:rPr>
-        <w:t xml:space="preserve">슬라이드 15  —  07 친환경 - 로터 세일 및 EEDI     [32초 · 누적 8:25]</w:t>
+        <w:t xml:space="preserve">슬라이드 15  —  07 친환경 - 로터 세일 및 EEDI     [32초 · 누적 8:17]</w:t>
       </w:r>
     </w:p>
     <w:p>
@@ -6183,7 +6183,7 @@
           <w:sz w:val="23"/>
           <w:szCs w:val="23"/>
         </w:rPr>
-        <w:t xml:space="preserve">슬라이드 16  —  경제성 및 설계 결과 요약     [35초 · 누적 9:02]</w:t>
+        <w:t xml:space="preserve">슬라이드 16  —  경제성 및 설계 결과 요약     [41초 · 누적 9:00]</w:t>
       </w:r>
     </w:p>
     <w:p>
@@ -6261,7 +6261,7 @@
                 <w:sz w:val="23"/>
                 <w:szCs w:val="23"/>
               </w:rPr>
-              <w:t xml:space="preserve">경제성입니다. 건조비는 약 2,666만 달러입니다. 회수기간은 2026년 8월 시황 기준 0.81년이지만, LR1 5년 평균 운임과 시장 신조선가를 적용하면 약 8년으로 시황에 크게 좌우됩니다. 정리하면 본 설계선은 국제 규정과 선급 요건을 모두 만족하면서, 메탄올 이중연료와 축발전기, 로터 세일로 EEDI Phase 3까지 만족시킨 74K급 원유운반선입니다.</w:t>
+              <w:t xml:space="preserve">경제성입니다. 건조비는 약 2,666만 달러입니다. 회수기간은 2026년 8월 시황 기준 0.81년이지만, LR1 5년 평균 운임과 시장 신조선가를 적용하면 약 8년으로 시황에 크게 좌우됩니다. 정리하면 본 설계선은 국제 규정과 선급 요건을 모두 만족하면서, 메탄올 이중연료와 축발전기, 로터 세일로 EEDI Phase 3까지 만족시킨 74K급 원유운반선입니다. 캐비테이션 정량 검토와 로터 기초 해석은 후속 과제로 인식하고 있습니다.</w:t>
             </w:r>
           </w:p>
         </w:tc>
@@ -6310,7 +6310,7 @@
           <w:sz w:val="23"/>
           <w:szCs w:val="23"/>
         </w:rPr>
-        <w:t xml:space="preserve">슬라이드 17  —  감사합니다     [4초 · 누적 9:09]</w:t>
+        <w:t xml:space="preserve">슬라이드 17  —  감사합니다     [4초 · 누적 9:07]</w:t>
       </w:r>
     </w:p>
     <w:p>

</xml_diff>